<commit_message>
feat(v1.0.2): release IRM v1.0.2 with VisaSymbol, offline support, and UI enhancements
- Add VisaSymbol field across models, Import/Export, Reports, and Employee dialogs
- Upgrade SignalR buffer to 10MB and add client timeout for large file processing
- Implement IDisposable in Import.razor to prevent memory stream leaks
- Standardize local offline assets (vendor/chart.umd.min.js) and align all UI version badges to v1.0.2
- Add SQL Server migrations InitialSqlServerV101 and AddVisaSymbol
- Verify full test suite passing (84/84 tests)
</commit_message>
<xml_diff>
--- a/docs/TAI_LIEU_TAP_HUAN_SU_DUNG.docx
+++ b/docs/TAI_LIEU_TAP_HUAN_SU_DUNG.docx
@@ -4,9 +4,11 @@
   <w:body>
     <w:p>
       <w:pPr>
-        <w:pStyle w:val="Heading1"/>
+        <w:pStyle w:val="Title"/>
+        <w:jc w:val="left"/>
       </w:pPr>
       <w:r>
+        <w:rPr/>
         <w:t>TÀI LIỆU TẬP HUẤN SỬ DỤNG PHẦN MỀM</w:t>
       </w:r>
     </w:p>
@@ -15,6 +17,7 @@
         <w:pStyle w:val="Heading1"/>
       </w:pPr>
       <w:r>
+        <w:rPr/>
         <w:t>📋 HỆ THỐNG QUẢN LÝ NGƯỜI NƯỚC NGOÀI (IRM)</w:t>
       </w:r>
     </w:p>
@@ -28,7 +31,7 @@
         <w:rPr>
           <w:sz w:val="22"/>
         </w:rPr>
-        <w:t>Immigration Report Manager — Phiên bản v0.1.1</w:t>
+        <w:t>Immigration Report Manager — Phiên bản v1.0.1</w:t>
       </w:r>
     </w:p>
     <w:p>
@@ -133,7 +136,7 @@
               <w:rPr>
                 <w:sz w:val="19"/>
               </w:rPr>
-              <w:t>Immigration Report Manager (IRM) v0.1.1</w:t>
+              <w:t>Immigration Report Manager (IRM) v1.0.1</w:t>
             </w:r>
           </w:p>
         </w:tc>
@@ -256,7 +259,7 @@
               <w:rPr>
                 <w:sz w:val="19"/>
               </w:rPr>
-              <w:t>Tháng 08/2026</w:t>
+              <w:t>Tháng 09/2026</w:t>
             </w:r>
           </w:p>
         </w:tc>
@@ -282,6 +285,7 @@
         <w:pStyle w:val="Heading2"/>
       </w:pPr>
       <w:r>
+        <w:rPr/>
         <w:t>MỤC LỤC</w:t>
       </w:r>
     </w:p>
@@ -290,220 +294,6 @@
         <w:rPr>
           <w:rFonts w:hint="eastAsia"/>
         </w:rPr>
-      </w:pPr>
-      <w:r>
-        <w:rPr>
-          <w:sz w:val="22"/>
-        </w:rPr>
-        <w:t>1. [Đăng nhập Hệ thống](#1-đăng-nhập-hệ-thống)</w:t>
-      </w:r>
-    </w:p>
-    <w:p>
-      <w:pPr>
-        <w:rPr>
-          <w:rFonts w:hint="eastAsia"/>
-        </w:rPr>
-      </w:pPr>
-      <w:r>
-        <w:rPr>
-          <w:sz w:val="22"/>
-        </w:rPr>
-        <w:t>2. [Bảng điều khiển (Dashboard)](#2-bảng-điều-khiển-dashboard)</w:t>
-      </w:r>
-    </w:p>
-    <w:p>
-      <w:pPr>
-        <w:rPr>
-          <w:rFonts w:hint="eastAsia"/>
-        </w:rPr>
-      </w:pPr>
-      <w:r>
-        <w:rPr>
-          <w:sz w:val="22"/>
-        </w:rPr>
-        <w:t>3. [Hồ sơ NNN Hợp nhất (Mới)](#3-hồ-sơ-nnn-hợp-nhất)</w:t>
-      </w:r>
-    </w:p>
-    <w:p>
-      <w:pPr>
-        <w:rPr>
-          <w:rFonts w:hint="eastAsia"/>
-        </w:rPr>
-      </w:pPr>
-      <w:r>
-        <w:rPr>
-          <w:sz w:val="22"/>
-        </w:rPr>
-        <w:t>4. [Quản lý Doanh nghiệp](#4-quản-lý-doanh-nghiệp)</w:t>
-      </w:r>
-    </w:p>
-    <w:p>
-      <w:pPr>
-        <w:rPr>
-          <w:rFonts w:hint="eastAsia"/>
-        </w:rPr>
-      </w:pPr>
-      <w:r>
-        <w:rPr>
-          <w:sz w:val="22"/>
-        </w:rPr>
-        <w:t>5. [Hồ sơ Mở rộng Doanh nghiệp (FDI/KKT)](#5-hồ-sơ-mở-rộng-doanh-nghiệp-fdikkt)</w:t>
-      </w:r>
-    </w:p>
-    <w:p>
-      <w:pPr>
-        <w:rPr>
-          <w:rFonts w:hint="eastAsia"/>
-        </w:rPr>
-      </w:pPr>
-      <w:r>
-        <w:rPr>
-          <w:sz w:val="22"/>
-        </w:rPr>
-        <w:t>6. [Quản lý Lao động Nước ngoài](#6-quản-lý-lao-động-nước-ngoài)</w:t>
-      </w:r>
-    </w:p>
-    <w:p>
-      <w:pPr>
-        <w:rPr>
-          <w:rFonts w:hint="eastAsia"/>
-        </w:rPr>
-      </w:pPr>
-      <w:r>
-        <w:rPr>
-          <w:sz w:val="22"/>
-        </w:rPr>
-        <w:t>7. [Quản lý Du học sinh](#7-quản-lý-du-học-sinh)</w:t>
-      </w:r>
-    </w:p>
-    <w:p>
-      <w:pPr>
-        <w:rPr>
-          <w:rFonts w:hint="eastAsia"/>
-        </w:rPr>
-      </w:pPr>
-      <w:r>
-        <w:rPr>
-          <w:sz w:val="22"/>
-        </w:rPr>
-        <w:t>8. [Quản lý Thăm thân](#8-quản-lý-thăm-thân)</w:t>
-      </w:r>
-    </w:p>
-    <w:p>
-      <w:pPr>
-        <w:rPr>
-          <w:rFonts w:hint="eastAsia"/>
-        </w:rPr>
-      </w:pPr>
-      <w:r>
-        <w:rPr>
-          <w:sz w:val="22"/>
-        </w:rPr>
-        <w:t>9. [Import dữ liệu từ Excel](#9-import-dữ-liệu-từ-excel)</w:t>
-      </w:r>
-    </w:p>
-    <w:p>
-      <w:pPr>
-        <w:rPr>
-          <w:rFonts w:hint="eastAsia"/>
-        </w:rPr>
-      </w:pPr>
-      <w:r>
-        <w:rPr>
-          <w:sz w:val="22"/>
-        </w:rPr>
-        <w:t>10. [Tìm kiếm Toàn cục](#10-tìm-kiếm-toàn-cục)</w:t>
-      </w:r>
-    </w:p>
-    <w:p>
-      <w:pPr>
-        <w:rPr>
-          <w:rFonts w:hint="eastAsia"/>
-        </w:rPr>
-      </w:pPr>
-      <w:r>
-        <w:rPr>
-          <w:sz w:val="22"/>
-        </w:rPr>
-        <w:t>11. [Báo cáo Định kỳ &amp; Xuất Excel](#11-báo-cáo-định-kỳ--xuất-excel)</w:t>
-      </w:r>
-    </w:p>
-    <w:p>
-      <w:pPr>
-        <w:rPr>
-          <w:rFonts w:hint="eastAsia"/>
-        </w:rPr>
-      </w:pPr>
-      <w:r>
-        <w:rPr>
-          <w:sz w:val="22"/>
-        </w:rPr>
-        <w:t>12. [Thống kê 54 Địa bàn](#12-thống-kê-54-địa-bàn)</w:t>
-      </w:r>
-    </w:p>
-    <w:p>
-      <w:pPr>
-        <w:rPr>
-          <w:rFonts w:hint="eastAsia"/>
-        </w:rPr>
-      </w:pPr>
-      <w:r>
-        <w:rPr>
-          <w:sz w:val="22"/>
-        </w:rPr>
-        <w:t>13. [Quản lý Cơ sở Lưu trú](#13-quản-lý-cơ-sở-lưu-trú)</w:t>
-      </w:r>
-    </w:p>
-    <w:p>
-      <w:pPr>
-        <w:rPr>
-          <w:rFonts w:hint="eastAsia"/>
-        </w:rPr>
-      </w:pPr>
-      <w:r>
-        <w:rPr>
-          <w:sz w:val="22"/>
-        </w:rPr>
-        <w:t>14. [Quản lý Đợt Kiểm tra](#14-quản-lý-đợt-kiểm-tra)</w:t>
-      </w:r>
-    </w:p>
-    <w:p>
-      <w:pPr>
-        <w:rPr>
-          <w:rFonts w:hint="eastAsia"/>
-        </w:rPr>
-      </w:pPr>
-      <w:r>
-        <w:rPr>
-          <w:sz w:val="22"/>
-        </w:rPr>
-        <w:t>15. [Quản trị Hệ thống (Dành cho Admin)](#15-quản-trị-hệ-thống-dành-cho-admin)</w:t>
-      </w:r>
-    </w:p>
-    <w:p>
-      <w:pPr>
-        <w:rPr>
-          <w:rFonts w:hint="eastAsia"/>
-        </w:rPr>
-      </w:pPr>
-      <w:r>
-        <w:rPr>
-          <w:sz w:val="22"/>
-        </w:rPr>
-        <w:t>16. [Phím tắt &amp; Mẹo sử dụng](#16-phím-tắt--mẹo-sử-dụng)</w:t>
-      </w:r>
-    </w:p>
-    <w:p>
-      <w:pPr>
-        <w:spacing w:after="160"/>
-        <w:rPr>
-          <w:rFonts w:hint="eastAsia"/>
-        </w:rPr>
-      </w:pPr>
-    </w:p>
-    <w:p>
-      <w:pPr>
-        <w:pStyle w:val="Heading2"/>
       </w:pPr>
       <w:r>
         <w:t>1. Đăng nhập Hệ thống</w:t>
@@ -511,9 +301,177 @@
     </w:p>
     <w:p>
       <w:pPr>
+        <w:rPr>
+          <w:rFonts w:hint="eastAsia"/>
+        </w:rPr>
+      </w:pPr>
+      <w:r>
+        <w:t>2. Bảng điều khiển (Dashboard)</w:t>
+      </w:r>
+    </w:p>
+    <w:p>
+      <w:pPr>
+        <w:rPr>
+          <w:rFonts w:hint="eastAsia"/>
+        </w:rPr>
+      </w:pPr>
+      <w:r>
+        <w:t>3. Hồ sơ NNN Hợp nhất (Mới)</w:t>
+      </w:r>
+    </w:p>
+    <w:p>
+      <w:pPr>
+        <w:rPr>
+          <w:rFonts w:hint="eastAsia"/>
+        </w:rPr>
+      </w:pPr>
+      <w:r>
+        <w:t>4. Quản lý Doanh nghiệp</w:t>
+      </w:r>
+    </w:p>
+    <w:p>
+      <w:pPr>
+        <w:rPr>
+          <w:rFonts w:hint="eastAsia"/>
+        </w:rPr>
+      </w:pPr>
+      <w:r>
+        <w:t>5. Hồ sơ Mở rộng Doanh nghiệp (FDI/KKT)</w:t>
+      </w:r>
+    </w:p>
+    <w:p>
+      <w:pPr>
+        <w:rPr>
+          <w:rFonts w:hint="eastAsia"/>
+        </w:rPr>
+      </w:pPr>
+      <w:r>
+        <w:t>6. Quản lý Lao động Nước ngoài</w:t>
+      </w:r>
+    </w:p>
+    <w:p>
+      <w:pPr>
+        <w:rPr>
+          <w:rFonts w:hint="eastAsia"/>
+        </w:rPr>
+      </w:pPr>
+      <w:r>
+        <w:t>7. Quản lý Du học sinh</w:t>
+      </w:r>
+    </w:p>
+    <w:p>
+      <w:pPr>
+        <w:rPr>
+          <w:rFonts w:hint="eastAsia"/>
+        </w:rPr>
+      </w:pPr>
+      <w:r>
+        <w:t>8. Quản lý Thăm thân</w:t>
+      </w:r>
+    </w:p>
+    <w:p>
+      <w:pPr>
+        <w:rPr>
+          <w:rFonts w:hint="eastAsia"/>
+        </w:rPr>
+      </w:pPr>
+      <w:r>
+        <w:t>9. Import dữ liệu từ Excel</w:t>
+      </w:r>
+    </w:p>
+    <w:p>
+      <w:pPr>
+        <w:rPr>
+          <w:rFonts w:hint="eastAsia"/>
+        </w:rPr>
+      </w:pPr>
+      <w:r>
+        <w:t>10. Tìm kiếm Toàn cục</w:t>
+      </w:r>
+    </w:p>
+    <w:p>
+      <w:pPr>
+        <w:rPr>
+          <w:rFonts w:hint="eastAsia"/>
+        </w:rPr>
+      </w:pPr>
+      <w:r>
+        <w:t>11. Báo cáo Định kỳ &amp; Xuất Excel</w:t>
+      </w:r>
+    </w:p>
+    <w:p>
+      <w:pPr>
+        <w:rPr>
+          <w:rFonts w:hint="eastAsia"/>
+        </w:rPr>
+      </w:pPr>
+      <w:r>
+        <w:t>12. Thống kê 54 Địa bàn</w:t>
+      </w:r>
+    </w:p>
+    <w:p>
+      <w:pPr>
+        <w:rPr>
+          <w:rFonts w:hint="eastAsia"/>
+        </w:rPr>
+      </w:pPr>
+      <w:r>
+        <w:t>13. Quản lý Cơ sở Lưu trú</w:t>
+      </w:r>
+    </w:p>
+    <w:p>
+      <w:pPr>
+        <w:rPr>
+          <w:rFonts w:hint="eastAsia"/>
+        </w:rPr>
+      </w:pPr>
+      <w:r>
+        <w:t>14. Quản lý Đợt Kiểm tra</w:t>
+      </w:r>
+    </w:p>
+    <w:p>
+      <w:pPr>
+        <w:rPr>
+          <w:rFonts w:hint="eastAsia"/>
+        </w:rPr>
+      </w:pPr>
+      <w:r>
+        <w:t>15. Quản trị Hệ thống (Dành cho Admin)</w:t>
+      </w:r>
+    </w:p>
+    <w:p>
+      <w:pPr>
+        <w:rPr>
+          <w:rFonts w:hint="eastAsia"/>
+        </w:rPr>
+      </w:pPr>
+      <w:r>
+        <w:t>16. Phím tắt &amp; Mẹo sử dụng</w:t>
+      </w:r>
+    </w:p>
+    <w:p>
+      <w:pPr>
+        <w:spacing w:after="160"/>
+        <w:rPr>
+          <w:rFonts w:hint="eastAsia"/>
+        </w:rPr>
+      </w:pPr>
+    </w:p>
+    <w:p>
+      <w:pPr>
+        <w:pStyle w:val="Heading2"/>
+      </w:pPr>
+      <w:r>
+        <w:rPr/>
+        <w:t>1. Đăng nhập Hệ thống</w:t>
+      </w:r>
+    </w:p>
+    <w:p>
+      <w:pPr>
         <w:pStyle w:val="Heading3"/>
       </w:pPr>
       <w:r>
+        <w:rPr/>
         <w:t>1.1. Màn hình Đăng nhập</w:t>
       </w:r>
     </w:p>
@@ -541,42 +499,6 @@
         <w:rPr>
           <w:noProof/>
         </w:rPr>
-        <w:lastRenderedPageBreak/>
-        <w:drawing>
-          <wp:inline distT="0" distB="0" distL="0" distR="0" wp14:anchorId="07EFBD38" wp14:editId="133AD1E8">
-            <wp:extent cx="5486400" cy="3062177"/>
-            <wp:effectExtent l="0" t="0" r="0" b="0"/>
-            <wp:docPr id="1" name="Picture 1"/>
-            <wp:cNvGraphicFramePr>
-              <a:graphicFrameLocks xmlns:a="http://schemas.openxmlformats.org/drawingml/2006/main" noChangeAspect="1"/>
-            </wp:cNvGraphicFramePr>
-            <a:graphic xmlns:a="http://schemas.openxmlformats.org/drawingml/2006/main">
-              <a:graphicData uri="http://schemas.openxmlformats.org/drawingml/2006/picture">
-                <pic:pic xmlns:pic="http://schemas.openxmlformats.org/drawingml/2006/picture">
-                  <pic:nvPicPr>
-                    <pic:cNvPr id="0" name="login_screen.jpg"/>
-                    <pic:cNvPicPr/>
-                  </pic:nvPicPr>
-                  <pic:blipFill>
-                    <a:blip r:embed="rId6"/>
-                    <a:stretch>
-                      <a:fillRect/>
-                    </a:stretch>
-                  </pic:blipFill>
-                  <pic:spPr>
-                    <a:xfrm>
-                      <a:off x="0" y="0"/>
-                      <a:ext cx="5486400" cy="3062177"/>
-                    </a:xfrm>
-                    <a:prstGeom prst="rect">
-                      <a:avLst/>
-                    </a:prstGeom>
-                  </pic:spPr>
-                </pic:pic>
-              </a:graphicData>
-            </a:graphic>
-          </wp:inline>
-        </w:drawing>
       </w:r>
     </w:p>
     <w:p>
@@ -595,10 +517,16 @@
       </w:r>
     </w:p>
     <w:p>
+      <w:r>
+        <w:br w:type="page"/>
+      </w:r>
+    </w:p>
+    <w:p>
       <w:pPr>
         <w:pStyle w:val="Heading3"/>
       </w:pPr>
       <w:r>
+        <w:rPr/>
         <w:t>1.2. Các bước đăng nhập</w:t>
       </w:r>
     </w:p>
@@ -796,6 +724,7 @@
         <w:pStyle w:val="Heading3"/>
       </w:pPr>
       <w:r>
+        <w:rPr/>
         <w:t>1.3. Xử lý sự cố đăng nhập</w:t>
       </w:r>
     </w:p>
@@ -1086,6 +1015,7 @@
         <w:pStyle w:val="Heading3"/>
       </w:pPr>
       <w:r>
+        <w:rPr/>
         <w:t>1.4. Đăng xuất</w:t>
       </w:r>
     </w:p>
@@ -1115,6 +1045,7 @@
         <w:pStyle w:val="Heading2"/>
       </w:pPr>
       <w:r>
+        <w:rPr/>
         <w:t>2. Bảng điều khiển (Dashboard)</w:t>
       </w:r>
     </w:p>
@@ -1123,6 +1054,7 @@
         <w:pStyle w:val="Heading3"/>
       </w:pPr>
       <w:r>
+        <w:rPr/>
         <w:t>2.1. Tổng quan</w:t>
       </w:r>
     </w:p>
@@ -1150,42 +1082,6 @@
         <w:rPr>
           <w:noProof/>
         </w:rPr>
-        <w:lastRenderedPageBreak/>
-        <w:drawing>
-          <wp:inline distT="0" distB="0" distL="0" distR="0" wp14:anchorId="52936C79" wp14:editId="7CB54AD3">
-            <wp:extent cx="5486400" cy="3062177"/>
-            <wp:effectExtent l="0" t="0" r="0" b="0"/>
-            <wp:docPr id="2" name="Picture 2"/>
-            <wp:cNvGraphicFramePr>
-              <a:graphicFrameLocks xmlns:a="http://schemas.openxmlformats.org/drawingml/2006/main" noChangeAspect="1"/>
-            </wp:cNvGraphicFramePr>
-            <a:graphic xmlns:a="http://schemas.openxmlformats.org/drawingml/2006/main">
-              <a:graphicData uri="http://schemas.openxmlformats.org/drawingml/2006/picture">
-                <pic:pic xmlns:pic="http://schemas.openxmlformats.org/drawingml/2006/picture">
-                  <pic:nvPicPr>
-                    <pic:cNvPr id="0" name="dashboard_screen.jpg"/>
-                    <pic:cNvPicPr/>
-                  </pic:nvPicPr>
-                  <pic:blipFill>
-                    <a:blip r:embed="rId7"/>
-                    <a:stretch>
-                      <a:fillRect/>
-                    </a:stretch>
-                  </pic:blipFill>
-                  <pic:spPr>
-                    <a:xfrm>
-                      <a:off x="0" y="0"/>
-                      <a:ext cx="5486400" cy="3062177"/>
-                    </a:xfrm>
-                    <a:prstGeom prst="rect">
-                      <a:avLst/>
-                    </a:prstGeom>
-                  </pic:spPr>
-                </pic:pic>
-              </a:graphicData>
-            </a:graphic>
-          </wp:inline>
-        </w:drawing>
       </w:r>
     </w:p>
     <w:p>
@@ -1208,6 +1104,7 @@
         <w:pStyle w:val="Heading3"/>
       </w:pPr>
       <w:r>
+        <w:rPr/>
         <w:t>2.2. Các thành phần trên Dashboard</w:t>
       </w:r>
     </w:p>
@@ -1216,6 +1113,7 @@
         <w:pStyle w:val="Heading3"/>
       </w:pPr>
       <w:r>
+        <w:rPr/>
         <w:t>🔵 Thanh truy cập nhanh (Quick Actions)</w:t>
       </w:r>
     </w:p>
@@ -1549,6 +1447,7 @@
         <w:pStyle w:val="Heading3"/>
       </w:pPr>
       <w:r>
+        <w:rPr/>
         <w:t>📊 Thẻ KPI (6 thẻ chỉ số)</w:t>
       </w:r>
     </w:p>
@@ -2016,7 +1915,7 @@
         <w:pStyle w:val="Heading3"/>
       </w:pPr>
       <w:r>
-        <w:lastRenderedPageBreak/>
+        <w:rPr/>
         <w:t>📈 Biểu đồ</w:t>
       </w:r>
     </w:p>
@@ -2263,6 +2162,7 @@
         <w:pStyle w:val="Heading2"/>
       </w:pPr>
       <w:r>
+        <w:rPr/>
         <w:t>3. Hồ sơ NNN Hợp nhất</w:t>
       </w:r>
     </w:p>
@@ -2288,6 +2188,7 @@
         <w:pStyle w:val="Heading3"/>
       </w:pPr>
       <w:r>
+        <w:rPr/>
         <w:t>3.1. Truy cập</w:t>
       </w:r>
     </w:p>
@@ -2309,6 +2210,7 @@
         <w:pStyle w:val="Heading3"/>
       </w:pPr>
       <w:r>
+        <w:rPr/>
         <w:t>3.2. Ý nghĩa</w:t>
       </w:r>
     </w:p>
@@ -2330,6 +2232,7 @@
         <w:pStyle w:val="Heading3"/>
       </w:pPr>
       <w:r>
+        <w:rPr/>
         <w:t>3.3. Thẻ thống kê (4 thẻ)</w:t>
       </w:r>
     </w:p>
@@ -2568,6 +2471,7 @@
         <w:pStyle w:val="Heading3"/>
       </w:pPr>
       <w:r>
+        <w:rPr/>
         <w:t>3.4. Bộ lọc</w:t>
       </w:r>
     </w:p>
@@ -2724,6 +2628,7 @@
         <w:pStyle w:val="Heading3"/>
       </w:pPr>
       <w:r>
+        <w:rPr/>
         <w:t>3.5. Cột dữ liệu</w:t>
       </w:r>
     </w:p>
@@ -2950,7 +2855,6 @@
               <w:rPr>
                 <w:sz w:val="19"/>
               </w:rPr>
-              <w:lastRenderedPageBreak/>
               <w:t>học / 🟠 Du lịch (một người có thể có nhiều diện)</w:t>
             </w:r>
           </w:p>
@@ -2974,7 +2878,6 @@
               <w:rPr>
                 <w:sz w:val="19"/>
               </w:rPr>
-              <w:lastRenderedPageBreak/>
               <w:t>Giấy tờ thị thực / thẻ</w:t>
             </w:r>
           </w:p>
@@ -3052,6 +2955,7 @@
         <w:pStyle w:val="Heading3"/>
       </w:pPr>
       <w:r>
+        <w:rPr/>
         <w:t>3.6. Thao tác trên từng hồ sơ</w:t>
       </w:r>
     </w:p>
@@ -3266,6 +3170,7 @@
         <w:pStyle w:val="Heading3"/>
       </w:pPr>
       <w:r>
+        <w:rPr/>
         <w:t>3.7. Thêm hồ sơ NNN mới</w:t>
       </w:r>
     </w:p>
@@ -3488,6 +3393,7 @@
         <w:pStyle w:val="Heading2"/>
       </w:pPr>
       <w:r>
+        <w:rPr/>
         <w:t>4. Quản lý Doanh nghiệp</w:t>
       </w:r>
     </w:p>
@@ -3496,6 +3402,7 @@
         <w:pStyle w:val="Heading3"/>
       </w:pPr>
       <w:r>
+        <w:rPr/>
         <w:t>4.1. Màn hình Danh sách Doanh nghiệp</w:t>
       </w:r>
     </w:p>
@@ -3523,41 +3430,6 @@
         <w:rPr>
           <w:noProof/>
         </w:rPr>
-        <w:drawing>
-          <wp:inline distT="0" distB="0" distL="0" distR="0" wp14:anchorId="52047DEF" wp14:editId="11600847">
-            <wp:extent cx="5486400" cy="3062177"/>
-            <wp:effectExtent l="0" t="0" r="0" b="0"/>
-            <wp:docPr id="3" name="Picture 3"/>
-            <wp:cNvGraphicFramePr>
-              <a:graphicFrameLocks xmlns:a="http://schemas.openxmlformats.org/drawingml/2006/main" noChangeAspect="1"/>
-            </wp:cNvGraphicFramePr>
-            <a:graphic xmlns:a="http://schemas.openxmlformats.org/drawingml/2006/main">
-              <a:graphicData uri="http://schemas.openxmlformats.org/drawingml/2006/picture">
-                <pic:pic xmlns:pic="http://schemas.openxmlformats.org/drawingml/2006/picture">
-                  <pic:nvPicPr>
-                    <pic:cNvPr id="0" name="company_management.jpg"/>
-                    <pic:cNvPicPr/>
-                  </pic:nvPicPr>
-                  <pic:blipFill>
-                    <a:blip r:embed="rId8"/>
-                    <a:stretch>
-                      <a:fillRect/>
-                    </a:stretch>
-                  </pic:blipFill>
-                  <pic:spPr>
-                    <a:xfrm>
-                      <a:off x="0" y="0"/>
-                      <a:ext cx="5486400" cy="3062177"/>
-                    </a:xfrm>
-                    <a:prstGeom prst="rect">
-                      <a:avLst/>
-                    </a:prstGeom>
-                  </pic:spPr>
-                </pic:pic>
-              </a:graphicData>
-            </a:graphic>
-          </wp:inline>
-        </w:drawing>
       </w:r>
     </w:p>
     <w:p>
@@ -3580,7 +3452,7 @@
         <w:pStyle w:val="Heading3"/>
       </w:pPr>
       <w:r>
-        <w:lastRenderedPageBreak/>
+        <w:rPr/>
         <w:t>4.2. Tìm kiếm &amp; Lọc</w:t>
       </w:r>
     </w:p>
@@ -3778,6 +3650,7 @@
         <w:pStyle w:val="Heading3"/>
       </w:pPr>
       <w:r>
+        <w:rPr/>
         <w:t>4.3. Thêm Doanh nghiệp mới</w:t>
       </w:r>
     </w:p>
@@ -3975,6 +3848,7 @@
         <w:pStyle w:val="Heading3"/>
       </w:pPr>
       <w:r>
+        <w:rPr/>
         <w:t>4.4. Sửa/Xóa Doanh nghiệp</w:t>
       </w:r>
     </w:p>
@@ -4189,6 +4063,7 @@
         <w:pStyle w:val="Heading3"/>
       </w:pPr>
       <w:r>
+        <w:rPr/>
         <w:t>4.5. Hồ sơ mở rộng</w:t>
       </w:r>
     </w:p>
@@ -4218,6 +4093,7 @@
         <w:pStyle w:val="Heading2"/>
       </w:pPr>
       <w:r>
+        <w:rPr/>
         <w:t>5. Hồ sơ Mở rộng Doanh nghiệp (FDI/KKT)</w:t>
       </w:r>
     </w:p>
@@ -4243,6 +4119,7 @@
         <w:pStyle w:val="Heading3"/>
       </w:pPr>
       <w:r>
+        <w:rPr/>
         <w:t>5.1. Truy cập</w:t>
       </w:r>
     </w:p>
@@ -4264,6 +4141,7 @@
         <w:pStyle w:val="Heading3"/>
       </w:pPr>
       <w:r>
+        <w:rPr/>
         <w:t>5.2. Chọn Doanh nghiệp</w:t>
       </w:r>
     </w:p>
@@ -4315,7 +4193,7 @@
         <w:pStyle w:val="Heading3"/>
       </w:pPr>
       <w:r>
-        <w:lastRenderedPageBreak/>
+        <w:rPr/>
         <w:t>5.3. Hệ thống 6 Tab</w:t>
       </w:r>
     </w:p>
@@ -4337,6 +4215,7 @@
         <w:pStyle w:val="Heading3"/>
       </w:pPr>
       <w:r>
+        <w:rPr/>
         <w:t>Tab 1: Phân loại &amp; Pháp lý</w:t>
       </w:r>
     </w:p>
@@ -4547,6 +4426,7 @@
         <w:pStyle w:val="Heading3"/>
       </w:pPr>
       <w:r>
+        <w:rPr/>
         <w:t>Tab 2: Địa điểm &amp; Khu kinh tế</w:t>
       </w:r>
     </w:p>
@@ -4865,6 +4745,7 @@
         <w:pStyle w:val="Heading3"/>
       </w:pPr>
       <w:r>
+        <w:rPr/>
         <w:t>Tab 3: Cơ sở lưu trú đã thuê</w:t>
       </w:r>
     </w:p>
@@ -4916,6 +4797,7 @@
         <w:pStyle w:val="Heading3"/>
       </w:pPr>
       <w:r>
+        <w:rPr/>
         <w:t>Tab 4: Thân nhân NLĐ</w:t>
       </w:r>
     </w:p>
@@ -4952,6 +4834,7 @@
         <w:pStyle w:val="Heading3"/>
       </w:pPr>
       <w:r>
+        <w:rPr/>
         <w:t>Tab 5: Người đại diện pháp luật</w:t>
       </w:r>
     </w:p>
@@ -5216,7 +5099,7 @@
         <w:pStyle w:val="Heading3"/>
       </w:pPr>
       <w:r>
-        <w:lastRenderedPageBreak/>
+        <w:rPr/>
         <w:t>Tab 6: Hồ sơ pháp nhân Scan</w:t>
       </w:r>
     </w:p>
@@ -5452,9 +5335,7 @@
         <w:pStyle w:val="Heading2"/>
       </w:pPr>
       <w:r>
-        <w:rPr>
-          <w:highlight w:val="yellow"/>
-        </w:rPr>
+        <w:rPr/>
         <w:t>6. Quản lý Lao động Nước ngoài</w:t>
       </w:r>
     </w:p>
@@ -5463,6 +5344,7 @@
         <w:pStyle w:val="Heading3"/>
       </w:pPr>
       <w:r>
+        <w:rPr/>
         <w:t>6.1. Màn hình Danh sách Nhân viên</w:t>
       </w:r>
     </w:p>
@@ -5490,41 +5372,6 @@
         <w:rPr>
           <w:noProof/>
         </w:rPr>
-        <w:drawing>
-          <wp:inline distT="0" distB="0" distL="0" distR="0" wp14:anchorId="2C2A4617" wp14:editId="6CCF9FF8">
-            <wp:extent cx="5486400" cy="3062177"/>
-            <wp:effectExtent l="0" t="0" r="0" b="0"/>
-            <wp:docPr id="4" name="Picture 4"/>
-            <wp:cNvGraphicFramePr>
-              <a:graphicFrameLocks xmlns:a="http://schemas.openxmlformats.org/drawingml/2006/main" noChangeAspect="1"/>
-            </wp:cNvGraphicFramePr>
-            <a:graphic xmlns:a="http://schemas.openxmlformats.org/drawingml/2006/main">
-              <a:graphicData uri="http://schemas.openxmlformats.org/drawingml/2006/picture">
-                <pic:pic xmlns:pic="http://schemas.openxmlformats.org/drawingml/2006/picture">
-                  <pic:nvPicPr>
-                    <pic:cNvPr id="0" name="employee_list.jpg"/>
-                    <pic:cNvPicPr/>
-                  </pic:nvPicPr>
-                  <pic:blipFill>
-                    <a:blip r:embed="rId9"/>
-                    <a:stretch>
-                      <a:fillRect/>
-                    </a:stretch>
-                  </pic:blipFill>
-                  <pic:spPr>
-                    <a:xfrm>
-                      <a:off x="0" y="0"/>
-                      <a:ext cx="5486400" cy="3062177"/>
-                    </a:xfrm>
-                    <a:prstGeom prst="rect">
-                      <a:avLst/>
-                    </a:prstGeom>
-                  </pic:spPr>
-                </pic:pic>
-              </a:graphicData>
-            </a:graphic>
-          </wp:inline>
-        </w:drawing>
       </w:r>
     </w:p>
     <w:p>
@@ -5547,6 +5394,7 @@
         <w:pStyle w:val="Heading3"/>
       </w:pPr>
       <w:r>
+        <w:rPr/>
         <w:t>6.2. Bộ lọc Nhân viên</w:t>
       </w:r>
     </w:p>
@@ -5798,7 +5646,7 @@
         <w:pStyle w:val="Heading3"/>
       </w:pPr>
       <w:r>
-        <w:lastRenderedPageBreak/>
+        <w:rPr/>
         <w:t>6.3. Thêm Nhân viên mới</w:t>
       </w:r>
     </w:p>
@@ -6054,6 +5902,7 @@
         <w:pStyle w:val="Heading3"/>
       </w:pPr>
       <w:r>
+        <w:rPr/>
         <w:t>6.4. Cảnh báo Hết hạn</w:t>
       </w:r>
     </w:p>
@@ -6107,6 +5956,7 @@
         <w:pStyle w:val="Heading3"/>
       </w:pPr>
       <w:r>
+        <w:rPr/>
         <w:t>6.5. Xuất danh sách ra Excel</w:t>
       </w:r>
     </w:p>
@@ -6136,6 +5986,7 @@
         <w:pStyle w:val="Heading2"/>
       </w:pPr>
       <w:r>
+        <w:rPr/>
         <w:t>7. Quản lý Du học sinh</w:t>
       </w:r>
     </w:p>
@@ -6144,6 +5995,7 @@
         <w:pStyle w:val="Heading3"/>
       </w:pPr>
       <w:r>
+        <w:rPr/>
         <w:t>7.1. Truy cập</w:t>
       </w:r>
     </w:p>
@@ -6165,6 +6017,7 @@
         <w:pStyle w:val="Heading3"/>
       </w:pPr>
       <w:r>
+        <w:rPr/>
         <w:t>7.2. Thông tin Du học sinh</w:t>
       </w:r>
     </w:p>
@@ -6539,6 +6392,7 @@
         <w:pStyle w:val="Heading3"/>
       </w:pPr>
       <w:r>
+        <w:rPr/>
         <w:t>7.3. Các thao tác</w:t>
       </w:r>
     </w:p>
@@ -6785,6 +6639,7 @@
         <w:pStyle w:val="Heading2"/>
       </w:pPr>
       <w:r>
+        <w:rPr/>
         <w:t>8. Quản lý Thăm thân</w:t>
       </w:r>
     </w:p>
@@ -6793,6 +6648,7 @@
         <w:pStyle w:val="Heading3"/>
       </w:pPr>
       <w:r>
+        <w:rPr/>
         <w:t>8.1. Truy cập</w:t>
       </w:r>
     </w:p>
@@ -6814,6 +6670,7 @@
         <w:pStyle w:val="Heading3"/>
       </w:pPr>
       <w:r>
+        <w:rPr/>
         <w:t>8.2. Thông tin hồ sơ Thăm thân</w:t>
       </w:r>
     </w:p>
@@ -7039,6 +6896,7 @@
         <w:pStyle w:val="Heading3"/>
       </w:pPr>
       <w:r>
+        <w:rPr/>
         <w:t>8.3. Thêm hồ sơ Thăm thân</w:t>
       </w:r>
     </w:p>
@@ -7343,6 +7201,7 @@
         <w:pStyle w:val="Heading2"/>
       </w:pPr>
       <w:r>
+        <w:rPr/>
         <w:t>9. Import dữ liệu từ Excel</w:t>
       </w:r>
     </w:p>
@@ -7351,6 +7210,7 @@
         <w:pStyle w:val="Heading3"/>
       </w:pPr>
       <w:r>
+        <w:rPr/>
         <w:t>9.1. Tổng quan</w:t>
       </w:r>
     </w:p>
@@ -7372,6 +7232,7 @@
         <w:pStyle w:val="Heading3"/>
       </w:pPr>
       <w:r>
+        <w:rPr/>
         <w:t>9.2. Truy cập</w:t>
       </w:r>
     </w:p>
@@ -7393,7 +7254,7 @@
         <w:pStyle w:val="Heading3"/>
       </w:pPr>
       <w:r>
-        <w:lastRenderedPageBreak/>
+        <w:rPr/>
         <w:t>9.3. Quy trình Import (4 bước)</w:t>
       </w:r>
     </w:p>
@@ -7408,41 +7269,6 @@
         <w:rPr>
           <w:noProof/>
         </w:rPr>
-        <w:drawing>
-          <wp:inline distT="0" distB="0" distL="0" distR="0" wp14:anchorId="7438CF19" wp14:editId="426DE266">
-            <wp:extent cx="5486400" cy="3062177"/>
-            <wp:effectExtent l="0" t="0" r="0" b="0"/>
-            <wp:docPr id="5" name="Picture 5"/>
-            <wp:cNvGraphicFramePr>
-              <a:graphicFrameLocks xmlns:a="http://schemas.openxmlformats.org/drawingml/2006/main" noChangeAspect="1"/>
-            </wp:cNvGraphicFramePr>
-            <a:graphic xmlns:a="http://schemas.openxmlformats.org/drawingml/2006/main">
-              <a:graphicData uri="http://schemas.openxmlformats.org/drawingml/2006/picture">
-                <pic:pic xmlns:pic="http://schemas.openxmlformats.org/drawingml/2006/picture">
-                  <pic:nvPicPr>
-                    <pic:cNvPr id="0" name="import_wizard.jpg"/>
-                    <pic:cNvPicPr/>
-                  </pic:nvPicPr>
-                  <pic:blipFill>
-                    <a:blip r:embed="rId10"/>
-                    <a:stretch>
-                      <a:fillRect/>
-                    </a:stretch>
-                  </pic:blipFill>
-                  <pic:spPr>
-                    <a:xfrm>
-                      <a:off x="0" y="0"/>
-                      <a:ext cx="5486400" cy="3062177"/>
-                    </a:xfrm>
-                    <a:prstGeom prst="rect">
-                      <a:avLst/>
-                    </a:prstGeom>
-                  </pic:spPr>
-                </pic:pic>
-              </a:graphicData>
-            </a:graphic>
-          </wp:inline>
-        </w:drawing>
       </w:r>
     </w:p>
     <w:p>
@@ -7465,6 +7291,7 @@
         <w:pStyle w:val="Heading3"/>
       </w:pPr>
       <w:r>
+        <w:rPr/>
         <w:t>📌 Bước 1: Upload file</w:t>
       </w:r>
     </w:p>
@@ -7662,6 +7489,7 @@
         <w:pStyle w:val="Heading3"/>
       </w:pPr>
       <w:r>
+        <w:rPr/>
         <w:t>📌 Bước 2: Ghép cột (Column Mapping)</w:t>
       </w:r>
     </w:p>
@@ -8069,6 +7897,7 @@
         <w:pStyle w:val="Heading3"/>
       </w:pPr>
       <w:r>
+        <w:rPr/>
         <w:t>📌 Bước 3: Xem trước (Preview)</w:t>
       </w:r>
     </w:p>
@@ -8242,7 +8071,6 @@
               <w:rPr>
                 <w:sz w:val="19"/>
               </w:rPr>
-              <w:lastRenderedPageBreak/>
               <w:t>🟡 Trùng</w:t>
             </w:r>
           </w:p>
@@ -8369,6 +8197,7 @@
         <w:pStyle w:val="Heading3"/>
       </w:pPr>
       <w:r>
+        <w:rPr/>
         <w:t>📌 Bước 4: Kết quả</w:t>
       </w:r>
     </w:p>
@@ -8435,6 +8264,7 @@
         <w:pStyle w:val="Heading3"/>
       </w:pPr>
       <w:r>
+        <w:rPr/>
         <w:t>9.4. Hoàn tác (Rollback) Import</w:t>
       </w:r>
     </w:p>
@@ -8703,6 +8533,7 @@
         <w:pStyle w:val="Heading3"/>
       </w:pPr>
       <w:r>
+        <w:rPr/>
         <w:t>9.5. Nhập thủ công</w:t>
       </w:r>
     </w:p>
@@ -8732,6 +8563,7 @@
         <w:pStyle w:val="Heading2"/>
       </w:pPr>
       <w:r>
+        <w:rPr/>
         <w:t>10. Tìm kiếm Toàn cục</w:t>
       </w:r>
     </w:p>
@@ -8740,6 +8572,7 @@
         <w:pStyle w:val="Heading3"/>
       </w:pPr>
       <w:r>
+        <w:rPr/>
         <w:t>10.1. Cách truy cập</w:t>
       </w:r>
     </w:p>
@@ -8950,7 +8783,7 @@
         <w:pStyle w:val="Heading3"/>
       </w:pPr>
       <w:r>
-        <w:lastRenderedPageBreak/>
+        <w:rPr/>
         <w:t>10.2. Kết quả Tìm kiếm</w:t>
       </w:r>
     </w:p>
@@ -8965,41 +8798,6 @@
         <w:rPr>
           <w:noProof/>
         </w:rPr>
-        <w:drawing>
-          <wp:inline distT="0" distB="0" distL="0" distR="0" wp14:anchorId="0C9347B0" wp14:editId="0931DC3E">
-            <wp:extent cx="5486400" cy="3062177"/>
-            <wp:effectExtent l="0" t="0" r="0" b="0"/>
-            <wp:docPr id="6" name="Picture 6"/>
-            <wp:cNvGraphicFramePr>
-              <a:graphicFrameLocks xmlns:a="http://schemas.openxmlformats.org/drawingml/2006/main" noChangeAspect="1"/>
-            </wp:cNvGraphicFramePr>
-            <a:graphic xmlns:a="http://schemas.openxmlformats.org/drawingml/2006/main">
-              <a:graphicData uri="http://schemas.openxmlformats.org/drawingml/2006/picture">
-                <pic:pic xmlns:pic="http://schemas.openxmlformats.org/drawingml/2006/picture">
-                  <pic:nvPicPr>
-                    <pic:cNvPr id="0" name="search_results.jpg"/>
-                    <pic:cNvPicPr/>
-                  </pic:nvPicPr>
-                  <pic:blipFill>
-                    <a:blip r:embed="rId11"/>
-                    <a:stretch>
-                      <a:fillRect/>
-                    </a:stretch>
-                  </pic:blipFill>
-                  <pic:spPr>
-                    <a:xfrm>
-                      <a:off x="0" y="0"/>
-                      <a:ext cx="5486400" cy="3062177"/>
-                    </a:xfrm>
-                    <a:prstGeom prst="rect">
-                      <a:avLst/>
-                    </a:prstGeom>
-                  </pic:spPr>
-                </pic:pic>
-              </a:graphicData>
-            </a:graphic>
-          </wp:inline>
-        </w:drawing>
       </w:r>
     </w:p>
     <w:p>
@@ -9224,6 +9022,7 @@
         <w:pStyle w:val="Heading3"/>
       </w:pPr>
       <w:r>
+        <w:rPr/>
         <w:t>10.3. Lọc kết quả</w:t>
       </w:r>
     </w:p>
@@ -9330,6 +9129,7 @@
         <w:pStyle w:val="Heading2"/>
       </w:pPr>
       <w:r>
+        <w:rPr/>
         <w:t>11. Báo cáo Định kỳ &amp; Xuất Excel</w:t>
       </w:r>
     </w:p>
@@ -9338,6 +9138,7 @@
         <w:pStyle w:val="Heading3"/>
       </w:pPr>
       <w:r>
+        <w:rPr/>
         <w:t>11.1. Xuất nhanh từ danh sách</w:t>
       </w:r>
     </w:p>
@@ -9359,6 +9160,7 @@
         <w:pStyle w:val="Heading3"/>
       </w:pPr>
       <w:r>
+        <w:rPr/>
         <w:t>11.2. Báo cáo định kỳ</w:t>
       </w:r>
     </w:p>
@@ -9451,7 +9253,6 @@
               <w:rPr>
                 <w:sz w:val="19"/>
               </w:rPr>
-              <w:lastRenderedPageBreak/>
               <w:t>Danh sách Công ty</w:t>
             </w:r>
           </w:p>
@@ -9570,6 +9371,7 @@
         <w:pStyle w:val="Heading3"/>
       </w:pPr>
       <w:r>
+        <w:rPr/>
         <w:t>11.3. Định dạng file Excel xuất ra</w:t>
       </w:r>
     </w:p>
@@ -9646,6 +9448,7 @@
         <w:pStyle w:val="Heading2"/>
       </w:pPr>
       <w:r>
+        <w:rPr/>
         <w:t>12. Thống kê 54 Địa bàn</w:t>
       </w:r>
     </w:p>
@@ -9654,6 +9457,7 @@
         <w:pStyle w:val="Heading3"/>
       </w:pPr>
       <w:r>
+        <w:rPr/>
         <w:t>12.1. Truy cập</w:t>
       </w:r>
     </w:p>
@@ -9675,6 +9479,7 @@
         <w:pStyle w:val="Heading3"/>
       </w:pPr>
       <w:r>
+        <w:rPr/>
         <w:t>12.2. Giao diện Thống kê</w:t>
       </w:r>
     </w:p>
@@ -9689,41 +9494,6 @@
         <w:rPr>
           <w:noProof/>
         </w:rPr>
-        <w:drawing>
-          <wp:inline distT="0" distB="0" distL="0" distR="0" wp14:anchorId="58DAFDEE" wp14:editId="644C7145">
-            <wp:extent cx="5486400" cy="3062177"/>
-            <wp:effectExtent l="0" t="0" r="0" b="0"/>
-            <wp:docPr id="7" name="Picture 7"/>
-            <wp:cNvGraphicFramePr>
-              <a:graphicFrameLocks xmlns:a="http://schemas.openxmlformats.org/drawingml/2006/main" noChangeAspect="1"/>
-            </wp:cNvGraphicFramePr>
-            <a:graphic xmlns:a="http://schemas.openxmlformats.org/drawingml/2006/main">
-              <a:graphicData uri="http://schemas.openxmlformats.org/drawingml/2006/picture">
-                <pic:pic xmlns:pic="http://schemas.openxmlformats.org/drawingml/2006/picture">
-                  <pic:nvPicPr>
-                    <pic:cNvPr id="0" name="statistics_page.jpg"/>
-                    <pic:cNvPicPr/>
-                  </pic:nvPicPr>
-                  <pic:blipFill>
-                    <a:blip r:embed="rId12"/>
-                    <a:stretch>
-                      <a:fillRect/>
-                    </a:stretch>
-                  </pic:blipFill>
-                  <pic:spPr>
-                    <a:xfrm>
-                      <a:off x="0" y="0"/>
-                      <a:ext cx="5486400" cy="3062177"/>
-                    </a:xfrm>
-                    <a:prstGeom prst="rect">
-                      <a:avLst/>
-                    </a:prstGeom>
-                  </pic:spPr>
-                </pic:pic>
-              </a:graphicData>
-            </a:graphic>
-          </wp:inline>
-        </w:drawing>
       </w:r>
     </w:p>
     <w:p>
@@ -9746,6 +9516,7 @@
         <w:pStyle w:val="Heading3"/>
       </w:pPr>
       <w:r>
+        <w:rPr/>
         <w:t>12.3. Bộ lọc Thống kê</w:t>
       </w:r>
     </w:p>
@@ -9984,6 +9755,7 @@
         <w:pStyle w:val="Heading3"/>
       </w:pPr>
       <w:r>
+        <w:rPr/>
         <w:t>12.4. Các chế độ xem</w:t>
       </w:r>
     </w:p>
@@ -10063,7 +9835,6 @@
               <w:rPr>
                 <w:sz w:val="19"/>
               </w:rPr>
-              <w:lastRenderedPageBreak/>
               <w:t>Tổng quan địa bàn</w:t>
             </w:r>
           </w:p>
@@ -10240,6 +10011,7 @@
         <w:pStyle w:val="Heading3"/>
       </w:pPr>
       <w:r>
+        <w:rPr/>
         <w:t>12.5. Xuất thống kê</w:t>
       </w:r>
     </w:p>
@@ -10269,6 +10041,7 @@
         <w:pStyle w:val="Heading2"/>
       </w:pPr>
       <w:r>
+        <w:rPr/>
         <w:t>13. Quản lý Cơ sở Lưu trú</w:t>
       </w:r>
     </w:p>
@@ -10277,6 +10050,7 @@
         <w:pStyle w:val="Heading3"/>
       </w:pPr>
       <w:r>
+        <w:rPr/>
         <w:t>13.1. Truy cập</w:t>
       </w:r>
     </w:p>
@@ -10298,6 +10072,7 @@
         <w:pStyle w:val="Heading3"/>
       </w:pPr>
       <w:r>
+        <w:rPr/>
         <w:t>13.2. Thông tin CSLT</w:t>
       </w:r>
     </w:p>
@@ -10618,6 +10393,7 @@
         <w:pStyle w:val="Heading3"/>
       </w:pPr>
       <w:r>
+        <w:rPr/>
         <w:t>13.3. Các thao tác</w:t>
       </w:r>
     </w:p>
@@ -10823,6 +10599,7 @@
         <w:pStyle w:val="Heading2"/>
       </w:pPr>
       <w:r>
+        <w:rPr/>
         <w:t>14. Quản lý Đợt Kiểm tra</w:t>
       </w:r>
     </w:p>
@@ -10831,6 +10608,7 @@
         <w:pStyle w:val="Heading3"/>
       </w:pPr>
       <w:r>
+        <w:rPr/>
         <w:t>14.1. Truy cập</w:t>
       </w:r>
     </w:p>
@@ -10852,6 +10630,7 @@
         <w:pStyle w:val="Heading3"/>
       </w:pPr>
       <w:r>
+        <w:rPr/>
         <w:t>14.2. Tạo Đợt kiểm tra mới</w:t>
       </w:r>
     </w:p>
@@ -10931,7 +10710,6 @@
               <w:rPr>
                 <w:sz w:val="19"/>
               </w:rPr>
-              <w:lastRenderedPageBreak/>
               <w:t>Bước 1</w:t>
             </w:r>
           </w:p>
@@ -11091,6 +10869,7 @@
         <w:pStyle w:val="Heading3"/>
       </w:pPr>
       <w:r>
+        <w:rPr/>
         <w:t>14.3. Thêm Đối tượng kiểm tra</w:t>
       </w:r>
     </w:p>
@@ -11367,6 +11146,7 @@
         <w:pStyle w:val="Heading2"/>
       </w:pPr>
       <w:r>
+        <w:rPr/>
         <w:t>15. Quản trị Hệ thống (Dành cho Admin)</w:t>
       </w:r>
     </w:p>
@@ -11392,6 +11172,7 @@
         <w:pStyle w:val="Heading3"/>
       </w:pPr>
       <w:r>
+        <w:rPr/>
         <w:t>15.1. Truy cập</w:t>
       </w:r>
     </w:p>
@@ -11413,6 +11194,7 @@
         <w:pStyle w:val="Heading3"/>
       </w:pPr>
       <w:r>
+        <w:rPr/>
         <w:t>15.2. Giao diện Quản trị</w:t>
       </w:r>
     </w:p>
@@ -11427,41 +11209,6 @@
         <w:rPr>
           <w:noProof/>
         </w:rPr>
-        <w:drawing>
-          <wp:inline distT="0" distB="0" distL="0" distR="0" wp14:anchorId="63A24DCA" wp14:editId="648F2389">
-            <wp:extent cx="5486400" cy="3062177"/>
-            <wp:effectExtent l="0" t="0" r="0" b="0"/>
-            <wp:docPr id="8" name="Picture 8"/>
-            <wp:cNvGraphicFramePr>
-              <a:graphicFrameLocks xmlns:a="http://schemas.openxmlformats.org/drawingml/2006/main" noChangeAspect="1"/>
-            </wp:cNvGraphicFramePr>
-            <a:graphic xmlns:a="http://schemas.openxmlformats.org/drawingml/2006/main">
-              <a:graphicData uri="http://schemas.openxmlformats.org/drawingml/2006/picture">
-                <pic:pic xmlns:pic="http://schemas.openxmlformats.org/drawingml/2006/picture">
-                  <pic:nvPicPr>
-                    <pic:cNvPr id="0" name="admin_panel.jpg"/>
-                    <pic:cNvPicPr/>
-                  </pic:nvPicPr>
-                  <pic:blipFill>
-                    <a:blip r:embed="rId13"/>
-                    <a:stretch>
-                      <a:fillRect/>
-                    </a:stretch>
-                  </pic:blipFill>
-                  <pic:spPr>
-                    <a:xfrm>
-                      <a:off x="0" y="0"/>
-                      <a:ext cx="5486400" cy="3062177"/>
-                    </a:xfrm>
-                    <a:prstGeom prst="rect">
-                      <a:avLst/>
-                    </a:prstGeom>
-                  </pic:spPr>
-                </pic:pic>
-              </a:graphicData>
-            </a:graphic>
-          </wp:inline>
-        </w:drawing>
       </w:r>
     </w:p>
     <w:p>
@@ -11489,7 +11236,6 @@
         <w:rPr>
           <w:sz w:val="22"/>
         </w:rPr>
-        <w:lastRenderedPageBreak/>
         <w:t>Giao diện gồm 4 tab:</w:t>
       </w:r>
     </w:p>
@@ -11498,6 +11244,7 @@
         <w:pStyle w:val="Heading3"/>
       </w:pPr>
       <w:r>
+        <w:rPr/>
         <w:t>Tab 1: Quản lý Tài khoản</w:t>
       </w:r>
     </w:p>
@@ -11979,6 +11726,7 @@
         <w:pStyle w:val="Heading3"/>
       </w:pPr>
       <w:r>
+        <w:rPr/>
         <w:t>Tab 2: Quản lý Danh mục</w:t>
       </w:r>
     </w:p>
@@ -12312,6 +12060,7 @@
         <w:pStyle w:val="Heading3"/>
       </w:pPr>
       <w:r>
+        <w:rPr/>
         <w:t>Tab 3: Nhật ký Hoạt động</w:t>
       </w:r>
     </w:p>
@@ -12617,7 +12366,7 @@
         <w:pStyle w:val="Heading3"/>
       </w:pPr>
       <w:r>
-        <w:lastRenderedPageBreak/>
+        <w:rPr/>
         <w:t>Tab 4: Lịch sử Import</w:t>
       </w:r>
     </w:p>
@@ -12647,6 +12396,7 @@
         <w:pStyle w:val="Heading2"/>
       </w:pPr>
       <w:r>
+        <w:rPr/>
         <w:t>16. Phím tắt &amp; Mẹo sử dụng</w:t>
       </w:r>
     </w:p>
@@ -12655,6 +12405,7 @@
         <w:pStyle w:val="Heading3"/>
       </w:pPr>
       <w:r>
+        <w:rPr/>
         <w:t>16.1. Phím tắt</w:t>
       </w:r>
     </w:p>
@@ -12811,6 +12562,7 @@
         <w:pStyle w:val="Heading3"/>
       </w:pPr>
       <w:r>
+        <w:rPr/>
         <w:t>16.2. Menu bên trái (Sidebar)</w:t>
       </w:r>
     </w:p>
@@ -12849,6 +12601,7 @@
         <w:pStyle w:val="Heading3"/>
       </w:pPr>
       <w:r>
+        <w:rPr/>
         <w:t>16.3. Chế độ Tối (Dark Mode)</w:t>
       </w:r>
     </w:p>
@@ -12870,6 +12623,7 @@
         <w:pStyle w:val="Heading3"/>
       </w:pPr>
       <w:r>
+        <w:rPr/>
         <w:t>16.4. Nút "Thêm nhanh"</w:t>
       </w:r>
     </w:p>
@@ -12966,6 +12720,7 @@
         <w:pStyle w:val="Heading3"/>
       </w:pPr>
       <w:r>
+        <w:rPr/>
         <w:t>16.5. Mẹo sử dụng hiệu quả</w:t>
       </w:r>
     </w:p>
@@ -13335,7 +13090,7 @@
         <w:pStyle w:val="Heading2"/>
       </w:pPr>
       <w:r>
-        <w:lastRenderedPageBreak/>
+        <w:rPr/>
         <w:t>Phụ lục: Bảng phân quyền chức năng</w:t>
       </w:r>
     </w:p>
@@ -13365,6 +13120,7 @@
           </w:tcPr>
           <w:p>
             <w:pPr>
+              <w:spacing w:before="0" w:after="0" w:line="240" w:lineRule="auto"/>
               <w:rPr>
                 <w:rFonts w:hint="eastAsia"/>
               </w:rPr>
@@ -13373,7 +13129,7 @@
               <w:rPr>
                 <w:b/>
                 <w:color w:val="FFFFFF"/>
-                <w:sz w:val="19"/>
+                <w:sz w:val="18"/>
               </w:rPr>
               <w:t>Chức năng</w:t>
             </w:r>
@@ -13386,6 +13142,7 @@
           </w:tcPr>
           <w:p>
             <w:pPr>
+              <w:spacing w:before="0" w:after="0" w:line="240" w:lineRule="auto"/>
               <w:rPr>
                 <w:rFonts w:hint="eastAsia"/>
               </w:rPr>
@@ -13394,7 +13151,7 @@
               <w:rPr>
                 <w:b/>
                 <w:color w:val="FFFFFF"/>
-                <w:sz w:val="19"/>
+                <w:sz w:val="18"/>
               </w:rPr>
               <w:t>Admin</w:t>
             </w:r>
@@ -13407,6 +13164,7 @@
           </w:tcPr>
           <w:p>
             <w:pPr>
+              <w:spacing w:before="0" w:after="0" w:line="240" w:lineRule="auto"/>
               <w:rPr>
                 <w:rFonts w:hint="eastAsia"/>
               </w:rPr>
@@ -13415,7 +13173,7 @@
               <w:rPr>
                 <w:b/>
                 <w:color w:val="FFFFFF"/>
-                <w:sz w:val="19"/>
+                <w:sz w:val="18"/>
               </w:rPr>
               <w:t>DataEditor</w:t>
             </w:r>
@@ -13428,6 +13186,7 @@
           </w:tcPr>
           <w:p>
             <w:pPr>
+              <w:spacing w:before="0" w:after="0" w:line="240" w:lineRule="auto"/>
               <w:rPr>
                 <w:rFonts w:hint="eastAsia"/>
               </w:rPr>
@@ -13436,7 +13195,7 @@
               <w:rPr>
                 <w:b/>
                 <w:color w:val="FFFFFF"/>
-                <w:sz w:val="19"/>
+                <w:sz w:val="18"/>
               </w:rPr>
               <w:t>Inspector</w:t>
             </w:r>
@@ -13449,6 +13208,7 @@
           </w:tcPr>
           <w:p>
             <w:pPr>
+              <w:spacing w:before="0" w:after="0" w:line="240" w:lineRule="auto"/>
               <w:rPr>
                 <w:rFonts w:hint="eastAsia"/>
               </w:rPr>
@@ -13457,7 +13217,7 @@
               <w:rPr>
                 <w:b/>
                 <w:color w:val="FFFFFF"/>
-                <w:sz w:val="19"/>
+                <w:sz w:val="18"/>
               </w:rPr>
               <w:t>Reporter</w:t>
             </w:r>
@@ -13470,6 +13230,7 @@
           </w:tcPr>
           <w:p>
             <w:pPr>
+              <w:spacing w:before="0" w:after="0" w:line="240" w:lineRule="auto"/>
               <w:rPr>
                 <w:rFonts w:hint="eastAsia"/>
               </w:rPr>
@@ -13478,7 +13239,7 @@
               <w:rPr>
                 <w:b/>
                 <w:color w:val="FFFFFF"/>
-                <w:sz w:val="19"/>
+                <w:sz w:val="18"/>
               </w:rPr>
               <w:t>Viewer</w:t>
             </w:r>
@@ -13495,13 +13256,14 @@
           </w:tcPr>
           <w:p>
             <w:pPr>
-              <w:rPr>
-                <w:rFonts w:hint="eastAsia"/>
-              </w:rPr>
-            </w:pPr>
-            <w:r>
-              <w:rPr>
-                <w:sz w:val="19"/>
+              <w:spacing w:before="0" w:after="0" w:line="240" w:lineRule="auto"/>
+              <w:rPr>
+                <w:rFonts w:hint="eastAsia"/>
+              </w:rPr>
+            </w:pPr>
+            <w:r>
+              <w:rPr>
+                <w:sz w:val="18"/>
               </w:rPr>
               <w:t>Xem Dashboard</w:t>
             </w:r>
@@ -13513,13 +13275,14 @@
           </w:tcPr>
           <w:p>
             <w:pPr>
-              <w:rPr>
-                <w:rFonts w:hint="eastAsia"/>
-              </w:rPr>
-            </w:pPr>
-            <w:r>
-              <w:rPr>
-                <w:sz w:val="19"/>
+              <w:spacing w:before="0" w:after="0" w:line="240" w:lineRule="auto"/>
+              <w:rPr>
+                <w:rFonts w:hint="eastAsia"/>
+              </w:rPr>
+            </w:pPr>
+            <w:r>
+              <w:rPr>
+                <w:sz w:val="18"/>
               </w:rPr>
               <w:t>✓</w:t>
             </w:r>
@@ -13531,13 +13294,14 @@
           </w:tcPr>
           <w:p>
             <w:pPr>
-              <w:rPr>
-                <w:rFonts w:hint="eastAsia"/>
-              </w:rPr>
-            </w:pPr>
-            <w:r>
-              <w:rPr>
-                <w:sz w:val="19"/>
+              <w:spacing w:before="0" w:after="0" w:line="240" w:lineRule="auto"/>
+              <w:rPr>
+                <w:rFonts w:hint="eastAsia"/>
+              </w:rPr>
+            </w:pPr>
+            <w:r>
+              <w:rPr>
+                <w:sz w:val="18"/>
               </w:rPr>
               <w:t>✓</w:t>
             </w:r>
@@ -13549,13 +13313,14 @@
           </w:tcPr>
           <w:p>
             <w:pPr>
-              <w:rPr>
-                <w:rFonts w:hint="eastAsia"/>
-              </w:rPr>
-            </w:pPr>
-            <w:r>
-              <w:rPr>
-                <w:sz w:val="19"/>
+              <w:spacing w:before="0" w:after="0" w:line="240" w:lineRule="auto"/>
+              <w:rPr>
+                <w:rFonts w:hint="eastAsia"/>
+              </w:rPr>
+            </w:pPr>
+            <w:r>
+              <w:rPr>
+                <w:sz w:val="18"/>
               </w:rPr>
               <w:t>✓</w:t>
             </w:r>
@@ -13567,13 +13332,14 @@
           </w:tcPr>
           <w:p>
             <w:pPr>
-              <w:rPr>
-                <w:rFonts w:hint="eastAsia"/>
-              </w:rPr>
-            </w:pPr>
-            <w:r>
-              <w:rPr>
-                <w:sz w:val="19"/>
+              <w:spacing w:before="0" w:after="0" w:line="240" w:lineRule="auto"/>
+              <w:rPr>
+                <w:rFonts w:hint="eastAsia"/>
+              </w:rPr>
+            </w:pPr>
+            <w:r>
+              <w:rPr>
+                <w:sz w:val="18"/>
               </w:rPr>
               <w:t>✓</w:t>
             </w:r>
@@ -13585,13 +13351,14 @@
           </w:tcPr>
           <w:p>
             <w:pPr>
-              <w:rPr>
-                <w:rFonts w:hint="eastAsia"/>
-              </w:rPr>
-            </w:pPr>
-            <w:r>
-              <w:rPr>
-                <w:sz w:val="19"/>
+              <w:spacing w:before="0" w:after="0" w:line="240" w:lineRule="auto"/>
+              <w:rPr>
+                <w:rFonts w:hint="eastAsia"/>
+              </w:rPr>
+            </w:pPr>
+            <w:r>
+              <w:rPr>
+                <w:sz w:val="18"/>
               </w:rPr>
               <w:t>✓</w:t>
             </w:r>
@@ -13608,13 +13375,14 @@
           </w:tcPr>
           <w:p>
             <w:pPr>
-              <w:rPr>
-                <w:rFonts w:hint="eastAsia"/>
-              </w:rPr>
-            </w:pPr>
-            <w:r>
-              <w:rPr>
-                <w:sz w:val="19"/>
+              <w:spacing w:before="0" w:after="0" w:line="240" w:lineRule="auto"/>
+              <w:rPr>
+                <w:rFonts w:hint="eastAsia"/>
+              </w:rPr>
+            </w:pPr>
+            <w:r>
+              <w:rPr>
+                <w:sz w:val="18"/>
               </w:rPr>
               <w:t>Xem danh sách</w:t>
             </w:r>
@@ -13626,13 +13394,14 @@
           </w:tcPr>
           <w:p>
             <w:pPr>
-              <w:rPr>
-                <w:rFonts w:hint="eastAsia"/>
-              </w:rPr>
-            </w:pPr>
-            <w:r>
-              <w:rPr>
-                <w:sz w:val="19"/>
+              <w:spacing w:before="0" w:after="0" w:line="240" w:lineRule="auto"/>
+              <w:rPr>
+                <w:rFonts w:hint="eastAsia"/>
+              </w:rPr>
+            </w:pPr>
+            <w:r>
+              <w:rPr>
+                <w:sz w:val="18"/>
               </w:rPr>
               <w:t>✓</w:t>
             </w:r>
@@ -13644,13 +13413,14 @@
           </w:tcPr>
           <w:p>
             <w:pPr>
-              <w:rPr>
-                <w:rFonts w:hint="eastAsia"/>
-              </w:rPr>
-            </w:pPr>
-            <w:r>
-              <w:rPr>
-                <w:sz w:val="19"/>
+              <w:spacing w:before="0" w:after="0" w:line="240" w:lineRule="auto"/>
+              <w:rPr>
+                <w:rFonts w:hint="eastAsia"/>
+              </w:rPr>
+            </w:pPr>
+            <w:r>
+              <w:rPr>
+                <w:sz w:val="18"/>
               </w:rPr>
               <w:t>✓</w:t>
             </w:r>
@@ -13662,13 +13432,14 @@
           </w:tcPr>
           <w:p>
             <w:pPr>
-              <w:rPr>
-                <w:rFonts w:hint="eastAsia"/>
-              </w:rPr>
-            </w:pPr>
-            <w:r>
-              <w:rPr>
-                <w:sz w:val="19"/>
+              <w:spacing w:before="0" w:after="0" w:line="240" w:lineRule="auto"/>
+              <w:rPr>
+                <w:rFonts w:hint="eastAsia"/>
+              </w:rPr>
+            </w:pPr>
+            <w:r>
+              <w:rPr>
+                <w:sz w:val="18"/>
               </w:rPr>
               <w:t>✓</w:t>
             </w:r>
@@ -13680,13 +13451,14 @@
           </w:tcPr>
           <w:p>
             <w:pPr>
-              <w:rPr>
-                <w:rFonts w:hint="eastAsia"/>
-              </w:rPr>
-            </w:pPr>
-            <w:r>
-              <w:rPr>
-                <w:sz w:val="19"/>
+              <w:spacing w:before="0" w:after="0" w:line="240" w:lineRule="auto"/>
+              <w:rPr>
+                <w:rFonts w:hint="eastAsia"/>
+              </w:rPr>
+            </w:pPr>
+            <w:r>
+              <w:rPr>
+                <w:sz w:val="18"/>
               </w:rPr>
               <w:t>✓</w:t>
             </w:r>
@@ -13698,13 +13470,14 @@
           </w:tcPr>
           <w:p>
             <w:pPr>
-              <w:rPr>
-                <w:rFonts w:hint="eastAsia"/>
-              </w:rPr>
-            </w:pPr>
-            <w:r>
-              <w:rPr>
-                <w:sz w:val="19"/>
+              <w:spacing w:before="0" w:after="0" w:line="240" w:lineRule="auto"/>
+              <w:rPr>
+                <w:rFonts w:hint="eastAsia"/>
+              </w:rPr>
+            </w:pPr>
+            <w:r>
+              <w:rPr>
+                <w:sz w:val="18"/>
               </w:rPr>
               <w:t>✓</w:t>
             </w:r>
@@ -13721,13 +13494,14 @@
           </w:tcPr>
           <w:p>
             <w:pPr>
-              <w:rPr>
-                <w:rFonts w:hint="eastAsia"/>
-              </w:rPr>
-            </w:pPr>
-            <w:r>
-              <w:rPr>
-                <w:sz w:val="19"/>
+              <w:spacing w:before="0" w:after="0" w:line="240" w:lineRule="auto"/>
+              <w:rPr>
+                <w:rFonts w:hint="eastAsia"/>
+              </w:rPr>
+            </w:pPr>
+            <w:r>
+              <w:rPr>
+                <w:sz w:val="18"/>
               </w:rPr>
               <w:t>Thêm/Sửa/Xóa dữ liệu</w:t>
             </w:r>
@@ -13739,13 +13513,14 @@
           </w:tcPr>
           <w:p>
             <w:pPr>
-              <w:rPr>
-                <w:rFonts w:hint="eastAsia"/>
-              </w:rPr>
-            </w:pPr>
-            <w:r>
-              <w:rPr>
-                <w:sz w:val="19"/>
+              <w:spacing w:before="0" w:after="0" w:line="240" w:lineRule="auto"/>
+              <w:rPr>
+                <w:rFonts w:hint="eastAsia"/>
+              </w:rPr>
+            </w:pPr>
+            <w:r>
+              <w:rPr>
+                <w:sz w:val="18"/>
               </w:rPr>
               <w:t>✓</w:t>
             </w:r>
@@ -13757,13 +13532,14 @@
           </w:tcPr>
           <w:p>
             <w:pPr>
-              <w:rPr>
-                <w:rFonts w:hint="eastAsia"/>
-              </w:rPr>
-            </w:pPr>
-            <w:r>
-              <w:rPr>
-                <w:sz w:val="19"/>
+              <w:spacing w:before="0" w:after="0" w:line="240" w:lineRule="auto"/>
+              <w:rPr>
+                <w:rFonts w:hint="eastAsia"/>
+              </w:rPr>
+            </w:pPr>
+            <w:r>
+              <w:rPr>
+                <w:sz w:val="18"/>
               </w:rPr>
               <w:t>✓</w:t>
             </w:r>
@@ -13775,13 +13551,14 @@
           </w:tcPr>
           <w:p>
             <w:pPr>
-              <w:rPr>
-                <w:rFonts w:hint="eastAsia"/>
-              </w:rPr>
-            </w:pPr>
-            <w:r>
-              <w:rPr>
-                <w:sz w:val="19"/>
+              <w:spacing w:before="0" w:after="0" w:line="240" w:lineRule="auto"/>
+              <w:rPr>
+                <w:rFonts w:hint="eastAsia"/>
+              </w:rPr>
+            </w:pPr>
+            <w:r>
+              <w:rPr>
+                <w:sz w:val="18"/>
               </w:rPr>
               <w:t>✗</w:t>
             </w:r>
@@ -13793,13 +13570,14 @@
           </w:tcPr>
           <w:p>
             <w:pPr>
-              <w:rPr>
-                <w:rFonts w:hint="eastAsia"/>
-              </w:rPr>
-            </w:pPr>
-            <w:r>
-              <w:rPr>
-                <w:sz w:val="19"/>
+              <w:spacing w:before="0" w:after="0" w:line="240" w:lineRule="auto"/>
+              <w:rPr>
+                <w:rFonts w:hint="eastAsia"/>
+              </w:rPr>
+            </w:pPr>
+            <w:r>
+              <w:rPr>
+                <w:sz w:val="18"/>
               </w:rPr>
               <w:t>✗</w:t>
             </w:r>
@@ -13811,13 +13589,14 @@
           </w:tcPr>
           <w:p>
             <w:pPr>
-              <w:rPr>
-                <w:rFonts w:hint="eastAsia"/>
-              </w:rPr>
-            </w:pPr>
-            <w:r>
-              <w:rPr>
-                <w:sz w:val="19"/>
+              <w:spacing w:before="0" w:after="0" w:line="240" w:lineRule="auto"/>
+              <w:rPr>
+                <w:rFonts w:hint="eastAsia"/>
+              </w:rPr>
+            </w:pPr>
+            <w:r>
+              <w:rPr>
+                <w:sz w:val="18"/>
               </w:rPr>
               <w:t>✗</w:t>
             </w:r>
@@ -13834,13 +13613,14 @@
           </w:tcPr>
           <w:p>
             <w:pPr>
-              <w:rPr>
-                <w:rFonts w:hint="eastAsia"/>
-              </w:rPr>
-            </w:pPr>
-            <w:r>
-              <w:rPr>
-                <w:sz w:val="19"/>
+              <w:spacing w:before="0" w:after="0" w:line="240" w:lineRule="auto"/>
+              <w:rPr>
+                <w:rFonts w:hint="eastAsia"/>
+              </w:rPr>
+            </w:pPr>
+            <w:r>
+              <w:rPr>
+                <w:sz w:val="18"/>
               </w:rPr>
               <w:t>Import Excel</w:t>
             </w:r>
@@ -13852,13 +13632,14 @@
           </w:tcPr>
           <w:p>
             <w:pPr>
-              <w:rPr>
-                <w:rFonts w:hint="eastAsia"/>
-              </w:rPr>
-            </w:pPr>
-            <w:r>
-              <w:rPr>
-                <w:sz w:val="19"/>
+              <w:spacing w:before="0" w:after="0" w:line="240" w:lineRule="auto"/>
+              <w:rPr>
+                <w:rFonts w:hint="eastAsia"/>
+              </w:rPr>
+            </w:pPr>
+            <w:r>
+              <w:rPr>
+                <w:sz w:val="18"/>
               </w:rPr>
               <w:t>✓</w:t>
             </w:r>
@@ -13870,13 +13651,14 @@
           </w:tcPr>
           <w:p>
             <w:pPr>
-              <w:rPr>
-                <w:rFonts w:hint="eastAsia"/>
-              </w:rPr>
-            </w:pPr>
-            <w:r>
-              <w:rPr>
-                <w:sz w:val="19"/>
+              <w:spacing w:before="0" w:after="0" w:line="240" w:lineRule="auto"/>
+              <w:rPr>
+                <w:rFonts w:hint="eastAsia"/>
+              </w:rPr>
+            </w:pPr>
+            <w:r>
+              <w:rPr>
+                <w:sz w:val="18"/>
               </w:rPr>
               <w:t>✓</w:t>
             </w:r>
@@ -13888,13 +13670,14 @@
           </w:tcPr>
           <w:p>
             <w:pPr>
-              <w:rPr>
-                <w:rFonts w:hint="eastAsia"/>
-              </w:rPr>
-            </w:pPr>
-            <w:r>
-              <w:rPr>
-                <w:sz w:val="19"/>
+              <w:spacing w:before="0" w:after="0" w:line="240" w:lineRule="auto"/>
+              <w:rPr>
+                <w:rFonts w:hint="eastAsia"/>
+              </w:rPr>
+            </w:pPr>
+            <w:r>
+              <w:rPr>
+                <w:sz w:val="18"/>
               </w:rPr>
               <w:t>✗</w:t>
             </w:r>
@@ -13906,13 +13689,14 @@
           </w:tcPr>
           <w:p>
             <w:pPr>
-              <w:rPr>
-                <w:rFonts w:hint="eastAsia"/>
-              </w:rPr>
-            </w:pPr>
-            <w:r>
-              <w:rPr>
-                <w:sz w:val="19"/>
+              <w:spacing w:before="0" w:after="0" w:line="240" w:lineRule="auto"/>
+              <w:rPr>
+                <w:rFonts w:hint="eastAsia"/>
+              </w:rPr>
+            </w:pPr>
+            <w:r>
+              <w:rPr>
+                <w:sz w:val="18"/>
               </w:rPr>
               <w:t>✗</w:t>
             </w:r>
@@ -13924,13 +13708,14 @@
           </w:tcPr>
           <w:p>
             <w:pPr>
-              <w:rPr>
-                <w:rFonts w:hint="eastAsia"/>
-              </w:rPr>
-            </w:pPr>
-            <w:r>
-              <w:rPr>
-                <w:sz w:val="19"/>
+              <w:spacing w:before="0" w:after="0" w:line="240" w:lineRule="auto"/>
+              <w:rPr>
+                <w:rFonts w:hint="eastAsia"/>
+              </w:rPr>
+            </w:pPr>
+            <w:r>
+              <w:rPr>
+                <w:sz w:val="18"/>
               </w:rPr>
               <w:t>✗</w:t>
             </w:r>
@@ -13947,13 +13732,14 @@
           </w:tcPr>
           <w:p>
             <w:pPr>
-              <w:rPr>
-                <w:rFonts w:hint="eastAsia"/>
-              </w:rPr>
-            </w:pPr>
-            <w:r>
-              <w:rPr>
-                <w:sz w:val="19"/>
+              <w:spacing w:before="0" w:after="0" w:line="240" w:lineRule="auto"/>
+              <w:rPr>
+                <w:rFonts w:hint="eastAsia"/>
+              </w:rPr>
+            </w:pPr>
+            <w:r>
+              <w:rPr>
+                <w:sz w:val="18"/>
               </w:rPr>
               <w:t>Tìm kiếm</w:t>
             </w:r>
@@ -13965,13 +13751,14 @@
           </w:tcPr>
           <w:p>
             <w:pPr>
-              <w:rPr>
-                <w:rFonts w:hint="eastAsia"/>
-              </w:rPr>
-            </w:pPr>
-            <w:r>
-              <w:rPr>
-                <w:sz w:val="19"/>
+              <w:spacing w:before="0" w:after="0" w:line="240" w:lineRule="auto"/>
+              <w:rPr>
+                <w:rFonts w:hint="eastAsia"/>
+              </w:rPr>
+            </w:pPr>
+            <w:r>
+              <w:rPr>
+                <w:sz w:val="18"/>
               </w:rPr>
               <w:t>✓</w:t>
             </w:r>
@@ -13983,13 +13770,14 @@
           </w:tcPr>
           <w:p>
             <w:pPr>
-              <w:rPr>
-                <w:rFonts w:hint="eastAsia"/>
-              </w:rPr>
-            </w:pPr>
-            <w:r>
-              <w:rPr>
-                <w:sz w:val="19"/>
+              <w:spacing w:before="0" w:after="0" w:line="240" w:lineRule="auto"/>
+              <w:rPr>
+                <w:rFonts w:hint="eastAsia"/>
+              </w:rPr>
+            </w:pPr>
+            <w:r>
+              <w:rPr>
+                <w:sz w:val="18"/>
               </w:rPr>
               <w:t>✓</w:t>
             </w:r>
@@ -14001,13 +13789,14 @@
           </w:tcPr>
           <w:p>
             <w:pPr>
-              <w:rPr>
-                <w:rFonts w:hint="eastAsia"/>
-              </w:rPr>
-            </w:pPr>
-            <w:r>
-              <w:rPr>
-                <w:sz w:val="19"/>
+              <w:spacing w:before="0" w:after="0" w:line="240" w:lineRule="auto"/>
+              <w:rPr>
+                <w:rFonts w:hint="eastAsia"/>
+              </w:rPr>
+            </w:pPr>
+            <w:r>
+              <w:rPr>
+                <w:sz w:val="18"/>
               </w:rPr>
               <w:t>✓</w:t>
             </w:r>
@@ -14019,13 +13808,14 @@
           </w:tcPr>
           <w:p>
             <w:pPr>
-              <w:rPr>
-                <w:rFonts w:hint="eastAsia"/>
-              </w:rPr>
-            </w:pPr>
-            <w:r>
-              <w:rPr>
-                <w:sz w:val="19"/>
+              <w:spacing w:before="0" w:after="0" w:line="240" w:lineRule="auto"/>
+              <w:rPr>
+                <w:rFonts w:hint="eastAsia"/>
+              </w:rPr>
+            </w:pPr>
+            <w:r>
+              <w:rPr>
+                <w:sz w:val="18"/>
               </w:rPr>
               <w:t>✓</w:t>
             </w:r>
@@ -14037,13 +13827,14 @@
           </w:tcPr>
           <w:p>
             <w:pPr>
-              <w:rPr>
-                <w:rFonts w:hint="eastAsia"/>
-              </w:rPr>
-            </w:pPr>
-            <w:r>
-              <w:rPr>
-                <w:sz w:val="19"/>
+              <w:spacing w:before="0" w:after="0" w:line="240" w:lineRule="auto"/>
+              <w:rPr>
+                <w:rFonts w:hint="eastAsia"/>
+              </w:rPr>
+            </w:pPr>
+            <w:r>
+              <w:rPr>
+                <w:sz w:val="18"/>
               </w:rPr>
               <w:t>✓</w:t>
             </w:r>
@@ -14060,13 +13851,14 @@
           </w:tcPr>
           <w:p>
             <w:pPr>
-              <w:rPr>
-                <w:rFonts w:hint="eastAsia"/>
-              </w:rPr>
-            </w:pPr>
-            <w:r>
-              <w:rPr>
-                <w:sz w:val="19"/>
+              <w:spacing w:before="0" w:after="0" w:line="240" w:lineRule="auto"/>
+              <w:rPr>
+                <w:rFonts w:hint="eastAsia"/>
+              </w:rPr>
+            </w:pPr>
+            <w:r>
+              <w:rPr>
+                <w:sz w:val="18"/>
               </w:rPr>
               <w:t>Xuất báo cáo</w:t>
             </w:r>
@@ -14078,13 +13870,14 @@
           </w:tcPr>
           <w:p>
             <w:pPr>
-              <w:rPr>
-                <w:rFonts w:hint="eastAsia"/>
-              </w:rPr>
-            </w:pPr>
-            <w:r>
-              <w:rPr>
-                <w:sz w:val="19"/>
+              <w:spacing w:before="0" w:after="0" w:line="240" w:lineRule="auto"/>
+              <w:rPr>
+                <w:rFonts w:hint="eastAsia"/>
+              </w:rPr>
+            </w:pPr>
+            <w:r>
+              <w:rPr>
+                <w:sz w:val="18"/>
               </w:rPr>
               <w:t>✓</w:t>
             </w:r>
@@ -14096,13 +13889,14 @@
           </w:tcPr>
           <w:p>
             <w:pPr>
-              <w:rPr>
-                <w:rFonts w:hint="eastAsia"/>
-              </w:rPr>
-            </w:pPr>
-            <w:r>
-              <w:rPr>
-                <w:sz w:val="19"/>
+              <w:spacing w:before="0" w:after="0" w:line="240" w:lineRule="auto"/>
+              <w:rPr>
+                <w:rFonts w:hint="eastAsia"/>
+              </w:rPr>
+            </w:pPr>
+            <w:r>
+              <w:rPr>
+                <w:sz w:val="18"/>
               </w:rPr>
               <w:t>✓</w:t>
             </w:r>
@@ -14114,13 +13908,14 @@
           </w:tcPr>
           <w:p>
             <w:pPr>
-              <w:rPr>
-                <w:rFonts w:hint="eastAsia"/>
-              </w:rPr>
-            </w:pPr>
-            <w:r>
-              <w:rPr>
-                <w:sz w:val="19"/>
+              <w:spacing w:before="0" w:after="0" w:line="240" w:lineRule="auto"/>
+              <w:rPr>
+                <w:rFonts w:hint="eastAsia"/>
+              </w:rPr>
+            </w:pPr>
+            <w:r>
+              <w:rPr>
+                <w:sz w:val="18"/>
               </w:rPr>
               <w:t>✗</w:t>
             </w:r>
@@ -14132,13 +13927,14 @@
           </w:tcPr>
           <w:p>
             <w:pPr>
-              <w:rPr>
-                <w:rFonts w:hint="eastAsia"/>
-              </w:rPr>
-            </w:pPr>
-            <w:r>
-              <w:rPr>
-                <w:sz w:val="19"/>
+              <w:spacing w:before="0" w:after="0" w:line="240" w:lineRule="auto"/>
+              <w:rPr>
+                <w:rFonts w:hint="eastAsia"/>
+              </w:rPr>
+            </w:pPr>
+            <w:r>
+              <w:rPr>
+                <w:sz w:val="18"/>
               </w:rPr>
               <w:t>✓</w:t>
             </w:r>
@@ -14150,13 +13946,14 @@
           </w:tcPr>
           <w:p>
             <w:pPr>
-              <w:rPr>
-                <w:rFonts w:hint="eastAsia"/>
-              </w:rPr>
-            </w:pPr>
-            <w:r>
-              <w:rPr>
-                <w:sz w:val="19"/>
+              <w:spacing w:before="0" w:after="0" w:line="240" w:lineRule="auto"/>
+              <w:rPr>
+                <w:rFonts w:hint="eastAsia"/>
+              </w:rPr>
+            </w:pPr>
+            <w:r>
+              <w:rPr>
+                <w:sz w:val="18"/>
               </w:rPr>
               <w:t>✓</w:t>
             </w:r>
@@ -14173,13 +13970,14 @@
           </w:tcPr>
           <w:p>
             <w:pPr>
-              <w:rPr>
-                <w:rFonts w:hint="eastAsia"/>
-              </w:rPr>
-            </w:pPr>
-            <w:r>
-              <w:rPr>
-                <w:sz w:val="19"/>
+              <w:spacing w:before="0" w:after="0" w:line="240" w:lineRule="auto"/>
+              <w:rPr>
+                <w:rFonts w:hint="eastAsia"/>
+              </w:rPr>
+            </w:pPr>
+            <w:r>
+              <w:rPr>
+                <w:sz w:val="18"/>
               </w:rPr>
               <w:t>Tạo đợt kiểm tra</w:t>
             </w:r>
@@ -14191,13 +13989,14 @@
           </w:tcPr>
           <w:p>
             <w:pPr>
-              <w:rPr>
-                <w:rFonts w:hint="eastAsia"/>
-              </w:rPr>
-            </w:pPr>
-            <w:r>
-              <w:rPr>
-                <w:sz w:val="19"/>
+              <w:spacing w:before="0" w:after="0" w:line="240" w:lineRule="auto"/>
+              <w:rPr>
+                <w:rFonts w:hint="eastAsia"/>
+              </w:rPr>
+            </w:pPr>
+            <w:r>
+              <w:rPr>
+                <w:sz w:val="18"/>
               </w:rPr>
               <w:t>✓</w:t>
             </w:r>
@@ -14209,13 +14008,14 @@
           </w:tcPr>
           <w:p>
             <w:pPr>
-              <w:rPr>
-                <w:rFonts w:hint="eastAsia"/>
-              </w:rPr>
-            </w:pPr>
-            <w:r>
-              <w:rPr>
-                <w:sz w:val="19"/>
+              <w:spacing w:before="0" w:after="0" w:line="240" w:lineRule="auto"/>
+              <w:rPr>
+                <w:rFonts w:hint="eastAsia"/>
+              </w:rPr>
+            </w:pPr>
+            <w:r>
+              <w:rPr>
+                <w:sz w:val="18"/>
               </w:rPr>
               <w:t>✗</w:t>
             </w:r>
@@ -14227,13 +14027,14 @@
           </w:tcPr>
           <w:p>
             <w:pPr>
-              <w:rPr>
-                <w:rFonts w:hint="eastAsia"/>
-              </w:rPr>
-            </w:pPr>
-            <w:r>
-              <w:rPr>
-                <w:sz w:val="19"/>
+              <w:spacing w:before="0" w:after="0" w:line="240" w:lineRule="auto"/>
+              <w:rPr>
+                <w:rFonts w:hint="eastAsia"/>
+              </w:rPr>
+            </w:pPr>
+            <w:r>
+              <w:rPr>
+                <w:sz w:val="18"/>
               </w:rPr>
               <w:t>✓</w:t>
             </w:r>
@@ -14245,13 +14046,14 @@
           </w:tcPr>
           <w:p>
             <w:pPr>
-              <w:rPr>
-                <w:rFonts w:hint="eastAsia"/>
-              </w:rPr>
-            </w:pPr>
-            <w:r>
-              <w:rPr>
-                <w:sz w:val="19"/>
+              <w:spacing w:before="0" w:after="0" w:line="240" w:lineRule="auto"/>
+              <w:rPr>
+                <w:rFonts w:hint="eastAsia"/>
+              </w:rPr>
+            </w:pPr>
+            <w:r>
+              <w:rPr>
+                <w:sz w:val="18"/>
               </w:rPr>
               <w:t>✗</w:t>
             </w:r>
@@ -14263,13 +14065,14 @@
           </w:tcPr>
           <w:p>
             <w:pPr>
-              <w:rPr>
-                <w:rFonts w:hint="eastAsia"/>
-              </w:rPr>
-            </w:pPr>
-            <w:r>
-              <w:rPr>
-                <w:sz w:val="19"/>
+              <w:spacing w:before="0" w:after="0" w:line="240" w:lineRule="auto"/>
+              <w:rPr>
+                <w:rFonts w:hint="eastAsia"/>
+              </w:rPr>
+            </w:pPr>
+            <w:r>
+              <w:rPr>
+                <w:sz w:val="18"/>
               </w:rPr>
               <w:t>✗</w:t>
             </w:r>
@@ -14286,13 +14089,14 @@
           </w:tcPr>
           <w:p>
             <w:pPr>
-              <w:rPr>
-                <w:rFonts w:hint="eastAsia"/>
-              </w:rPr>
-            </w:pPr>
-            <w:r>
-              <w:rPr>
-                <w:sz w:val="19"/>
+              <w:spacing w:before="0" w:after="0" w:line="240" w:lineRule="auto"/>
+              <w:rPr>
+                <w:rFonts w:hint="eastAsia"/>
+              </w:rPr>
+            </w:pPr>
+            <w:r>
+              <w:rPr>
+                <w:sz w:val="18"/>
               </w:rPr>
               <w:t>Xem thống kê</w:t>
             </w:r>
@@ -14304,13 +14108,14 @@
           </w:tcPr>
           <w:p>
             <w:pPr>
-              <w:rPr>
-                <w:rFonts w:hint="eastAsia"/>
-              </w:rPr>
-            </w:pPr>
-            <w:r>
-              <w:rPr>
-                <w:sz w:val="19"/>
+              <w:spacing w:before="0" w:after="0" w:line="240" w:lineRule="auto"/>
+              <w:rPr>
+                <w:rFonts w:hint="eastAsia"/>
+              </w:rPr>
+            </w:pPr>
+            <w:r>
+              <w:rPr>
+                <w:sz w:val="18"/>
               </w:rPr>
               <w:t>✓</w:t>
             </w:r>
@@ -14322,13 +14127,14 @@
           </w:tcPr>
           <w:p>
             <w:pPr>
-              <w:rPr>
-                <w:rFonts w:hint="eastAsia"/>
-              </w:rPr>
-            </w:pPr>
-            <w:r>
-              <w:rPr>
-                <w:sz w:val="19"/>
+              <w:spacing w:before="0" w:after="0" w:line="240" w:lineRule="auto"/>
+              <w:rPr>
+                <w:rFonts w:hint="eastAsia"/>
+              </w:rPr>
+            </w:pPr>
+            <w:r>
+              <w:rPr>
+                <w:sz w:val="18"/>
               </w:rPr>
               <w:t>✓</w:t>
             </w:r>
@@ -14340,13 +14146,14 @@
           </w:tcPr>
           <w:p>
             <w:pPr>
-              <w:rPr>
-                <w:rFonts w:hint="eastAsia"/>
-              </w:rPr>
-            </w:pPr>
-            <w:r>
-              <w:rPr>
-                <w:sz w:val="19"/>
+              <w:spacing w:before="0" w:after="0" w:line="240" w:lineRule="auto"/>
+              <w:rPr>
+                <w:rFonts w:hint="eastAsia"/>
+              </w:rPr>
+            </w:pPr>
+            <w:r>
+              <w:rPr>
+                <w:sz w:val="18"/>
               </w:rPr>
               <w:t>✓</w:t>
             </w:r>
@@ -14358,13 +14165,14 @@
           </w:tcPr>
           <w:p>
             <w:pPr>
-              <w:rPr>
-                <w:rFonts w:hint="eastAsia"/>
-              </w:rPr>
-            </w:pPr>
-            <w:r>
-              <w:rPr>
-                <w:sz w:val="19"/>
+              <w:spacing w:before="0" w:after="0" w:line="240" w:lineRule="auto"/>
+              <w:rPr>
+                <w:rFonts w:hint="eastAsia"/>
+              </w:rPr>
+            </w:pPr>
+            <w:r>
+              <w:rPr>
+                <w:sz w:val="18"/>
               </w:rPr>
               <w:t>✓</w:t>
             </w:r>
@@ -14376,13 +14184,14 @@
           </w:tcPr>
           <w:p>
             <w:pPr>
-              <w:rPr>
-                <w:rFonts w:hint="eastAsia"/>
-              </w:rPr>
-            </w:pPr>
-            <w:r>
-              <w:rPr>
-                <w:sz w:val="19"/>
+              <w:spacing w:before="0" w:after="0" w:line="240" w:lineRule="auto"/>
+              <w:rPr>
+                <w:rFonts w:hint="eastAsia"/>
+              </w:rPr>
+            </w:pPr>
+            <w:r>
+              <w:rPr>
+                <w:sz w:val="18"/>
               </w:rPr>
               <w:t>✓</w:t>
             </w:r>
@@ -14399,13 +14208,14 @@
           </w:tcPr>
           <w:p>
             <w:pPr>
-              <w:rPr>
-                <w:rFonts w:hint="eastAsia"/>
-              </w:rPr>
-            </w:pPr>
-            <w:r>
-              <w:rPr>
-                <w:sz w:val="19"/>
+              <w:spacing w:before="0" w:after="0" w:line="240" w:lineRule="auto"/>
+              <w:rPr>
+                <w:rFonts w:hint="eastAsia"/>
+              </w:rPr>
+            </w:pPr>
+            <w:r>
+              <w:rPr>
+                <w:sz w:val="18"/>
               </w:rPr>
               <w:t>Quản trị hệ thống</w:t>
             </w:r>
@@ -14417,13 +14227,14 @@
           </w:tcPr>
           <w:p>
             <w:pPr>
-              <w:rPr>
-                <w:rFonts w:hint="eastAsia"/>
-              </w:rPr>
-            </w:pPr>
-            <w:r>
-              <w:rPr>
-                <w:sz w:val="19"/>
+              <w:spacing w:before="0" w:after="0" w:line="240" w:lineRule="auto"/>
+              <w:rPr>
+                <w:rFonts w:hint="eastAsia"/>
+              </w:rPr>
+            </w:pPr>
+            <w:r>
+              <w:rPr>
+                <w:sz w:val="18"/>
               </w:rPr>
               <w:t>✓</w:t>
             </w:r>
@@ -14435,13 +14246,14 @@
           </w:tcPr>
           <w:p>
             <w:pPr>
-              <w:rPr>
-                <w:rFonts w:hint="eastAsia"/>
-              </w:rPr>
-            </w:pPr>
-            <w:r>
-              <w:rPr>
-                <w:sz w:val="19"/>
+              <w:spacing w:before="0" w:after="0" w:line="240" w:lineRule="auto"/>
+              <w:rPr>
+                <w:rFonts w:hint="eastAsia"/>
+              </w:rPr>
+            </w:pPr>
+            <w:r>
+              <w:rPr>
+                <w:sz w:val="18"/>
               </w:rPr>
               <w:t>✗</w:t>
             </w:r>
@@ -14453,13 +14265,14 @@
           </w:tcPr>
           <w:p>
             <w:pPr>
-              <w:rPr>
-                <w:rFonts w:hint="eastAsia"/>
-              </w:rPr>
-            </w:pPr>
-            <w:r>
-              <w:rPr>
-                <w:sz w:val="19"/>
+              <w:spacing w:before="0" w:after="0" w:line="240" w:lineRule="auto"/>
+              <w:rPr>
+                <w:rFonts w:hint="eastAsia"/>
+              </w:rPr>
+            </w:pPr>
+            <w:r>
+              <w:rPr>
+                <w:sz w:val="18"/>
               </w:rPr>
               <w:t>✗</w:t>
             </w:r>
@@ -14471,13 +14284,14 @@
           </w:tcPr>
           <w:p>
             <w:pPr>
-              <w:rPr>
-                <w:rFonts w:hint="eastAsia"/>
-              </w:rPr>
-            </w:pPr>
-            <w:r>
-              <w:rPr>
-                <w:sz w:val="19"/>
+              <w:spacing w:before="0" w:after="0" w:line="240" w:lineRule="auto"/>
+              <w:rPr>
+                <w:rFonts w:hint="eastAsia"/>
+              </w:rPr>
+            </w:pPr>
+            <w:r>
+              <w:rPr>
+                <w:sz w:val="18"/>
               </w:rPr>
               <w:t>✗</w:t>
             </w:r>
@@ -14489,13 +14303,14 @@
           </w:tcPr>
           <w:p>
             <w:pPr>
-              <w:rPr>
-                <w:rFonts w:hint="eastAsia"/>
-              </w:rPr>
-            </w:pPr>
-            <w:r>
-              <w:rPr>
-                <w:sz w:val="19"/>
+              <w:spacing w:before="0" w:after="0" w:line="240" w:lineRule="auto"/>
+              <w:rPr>
+                <w:rFonts w:hint="eastAsia"/>
+              </w:rPr>
+            </w:pPr>
+            <w:r>
+              <w:rPr>
+                <w:sz w:val="18"/>
               </w:rPr>
               <w:t>✗</w:t>
             </w:r>
@@ -14512,13 +14327,14 @@
           </w:tcPr>
           <w:p>
             <w:pPr>
-              <w:rPr>
-                <w:rFonts w:hint="eastAsia"/>
-              </w:rPr>
-            </w:pPr>
-            <w:r>
-              <w:rPr>
-                <w:sz w:val="19"/>
+              <w:spacing w:before="0" w:after="0" w:line="240" w:lineRule="auto"/>
+              <w:rPr>
+                <w:rFonts w:hint="eastAsia"/>
+              </w:rPr>
+            </w:pPr>
+            <w:r>
+              <w:rPr>
+                <w:sz w:val="18"/>
               </w:rPr>
               <w:t>Upload hồ sơ pháp lý</w:t>
             </w:r>
@@ -14530,13 +14346,14 @@
           </w:tcPr>
           <w:p>
             <w:pPr>
-              <w:rPr>
-                <w:rFonts w:hint="eastAsia"/>
-              </w:rPr>
-            </w:pPr>
-            <w:r>
-              <w:rPr>
-                <w:sz w:val="19"/>
+              <w:spacing w:before="0" w:after="0" w:line="240" w:lineRule="auto"/>
+              <w:rPr>
+                <w:rFonts w:hint="eastAsia"/>
+              </w:rPr>
+            </w:pPr>
+            <w:r>
+              <w:rPr>
+                <w:sz w:val="18"/>
               </w:rPr>
               <w:t>✓</w:t>
             </w:r>
@@ -14548,13 +14365,14 @@
           </w:tcPr>
           <w:p>
             <w:pPr>
-              <w:rPr>
-                <w:rFonts w:hint="eastAsia"/>
-              </w:rPr>
-            </w:pPr>
-            <w:r>
-              <w:rPr>
-                <w:sz w:val="19"/>
+              <w:spacing w:before="0" w:after="0" w:line="240" w:lineRule="auto"/>
+              <w:rPr>
+                <w:rFonts w:hint="eastAsia"/>
+              </w:rPr>
+            </w:pPr>
+            <w:r>
+              <w:rPr>
+                <w:sz w:val="18"/>
               </w:rPr>
               <w:t>✓</w:t>
             </w:r>
@@ -14566,13 +14384,14 @@
           </w:tcPr>
           <w:p>
             <w:pPr>
-              <w:rPr>
-                <w:rFonts w:hint="eastAsia"/>
-              </w:rPr>
-            </w:pPr>
-            <w:r>
-              <w:rPr>
-                <w:sz w:val="19"/>
+              <w:spacing w:before="0" w:after="0" w:line="240" w:lineRule="auto"/>
+              <w:rPr>
+                <w:rFonts w:hint="eastAsia"/>
+              </w:rPr>
+            </w:pPr>
+            <w:r>
+              <w:rPr>
+                <w:sz w:val="18"/>
               </w:rPr>
               <w:t>✗</w:t>
             </w:r>
@@ -14584,13 +14403,14 @@
           </w:tcPr>
           <w:p>
             <w:pPr>
-              <w:rPr>
-                <w:rFonts w:hint="eastAsia"/>
-              </w:rPr>
-            </w:pPr>
-            <w:r>
-              <w:rPr>
-                <w:sz w:val="19"/>
+              <w:spacing w:before="0" w:after="0" w:line="240" w:lineRule="auto"/>
+              <w:rPr>
+                <w:rFonts w:hint="eastAsia"/>
+              </w:rPr>
+            </w:pPr>
+            <w:r>
+              <w:rPr>
+                <w:sz w:val="18"/>
               </w:rPr>
               <w:t>✗</w:t>
             </w:r>
@@ -14602,13 +14422,14 @@
           </w:tcPr>
           <w:p>
             <w:pPr>
-              <w:rPr>
-                <w:rFonts w:hint="eastAsia"/>
-              </w:rPr>
-            </w:pPr>
-            <w:r>
-              <w:rPr>
-                <w:sz w:val="19"/>
+              <w:spacing w:before="0" w:after="0" w:line="240" w:lineRule="auto"/>
+              <w:rPr>
+                <w:rFonts w:hint="eastAsia"/>
+              </w:rPr>
+            </w:pPr>
+            <w:r>
+              <w:rPr>
+                <w:sz w:val="18"/>
               </w:rPr>
               <w:t>✗</w:t>
             </w:r>
@@ -14630,97 +14451,6 @@
           <w:rFonts w:hint="eastAsia"/>
         </w:rPr>
       </w:pPr>
-    </w:p>
-    <w:p>
-      <w:pPr>
-        <w:pStyle w:val="Heading2"/>
-      </w:pPr>
-      <w:r>
-        <w:t>Liên hệ Hỗ trợ</w:t>
-      </w:r>
-    </w:p>
-    <w:p>
-      <w:pPr>
-        <w:rPr>
-          <w:rFonts w:hint="eastAsia"/>
-        </w:rPr>
-      </w:pPr>
-      <w:r>
-        <w:rPr>
-          <w:sz w:val="22"/>
-        </w:rPr>
-        <w:t>Khi gặp sự cố kỹ thuật hoặc cần hỗ trợ sử dụng, vui lòng liên hệ:</w:t>
-      </w:r>
-    </w:p>
-    <w:p>
-      <w:pPr>
-        <w:pStyle w:val="ListBullet"/>
-        <w:spacing w:after="40"/>
-        <w:rPr>
-          <w:rFonts w:hint="eastAsia"/>
-        </w:rPr>
-      </w:pPr>
-      <w:r>
-        <w:rPr>
-          <w:sz w:val="21"/>
-        </w:rPr>
-        <w:t>Email: (điền email hỗ trợ)</w:t>
-      </w:r>
-    </w:p>
-    <w:p>
-      <w:pPr>
-        <w:pStyle w:val="ListBullet"/>
-        <w:spacing w:after="40"/>
-        <w:rPr>
-          <w:rFonts w:hint="eastAsia"/>
-        </w:rPr>
-      </w:pPr>
-      <w:r>
-        <w:rPr>
-          <w:sz w:val="21"/>
-        </w:rPr>
-        <w:t>Điện thoại: (điền SĐT hỗ trợ)</w:t>
-      </w:r>
-    </w:p>
-    <w:p>
-      <w:pPr>
-        <w:pStyle w:val="ListBullet"/>
-        <w:spacing w:after="40"/>
-        <w:rPr>
-          <w:rFonts w:hint="eastAsia"/>
-        </w:rPr>
-      </w:pPr>
-      <w:r>
-        <w:rPr>
-          <w:sz w:val="21"/>
-        </w:rPr>
-        <w:t>Giờ hỗ trợ: Thứ 2 – Thứ 6, 08:00 – 17:00</w:t>
-      </w:r>
-    </w:p>
-    <w:p>
-      <w:pPr>
-        <w:spacing w:after="160"/>
-        <w:rPr>
-          <w:rFonts w:hint="eastAsia"/>
-        </w:rPr>
-      </w:pPr>
-    </w:p>
-    <w:p>
-      <w:pPr>
-        <w:spacing w:before="80"/>
-        <w:ind w:left="567"/>
-        <w:rPr>
-          <w:rFonts w:hint="eastAsia"/>
-        </w:rPr>
-      </w:pPr>
-      <w:r>
-        <w:rPr>
-          <w:i/>
-          <w:color w:val="64748B"/>
-          <w:sz w:val="20"/>
-        </w:rPr>
-        <w:t>Tài liệu này được tạo cho phiên bản IRM v0.1.1. Nội dung có thể thay đổi theo cập nhật phần mềm.</w:t>
-      </w:r>
     </w:p>
     <w:sectPr>
       <w:pgSz w:w="11906" w:h="16838"/>
@@ -15351,7 +15081,7 @@
       <w:rFonts w:asciiTheme="majorHAnsi" w:eastAsiaTheme="majorEastAsia" w:hAnsiTheme="majorHAnsi" w:cstheme="majorBidi"/>
       <w:b/>
       <w:bCs/>
-      <w:color w:val="1E40AF"/>
+      <w:color w:val="000000"/>
       <w:sz w:val="28"/>
       <w:szCs w:val="28"/>
     </w:rPr>
@@ -15375,7 +15105,7 @@
       <w:rFonts w:asciiTheme="majorHAnsi" w:eastAsiaTheme="majorEastAsia" w:hAnsiTheme="majorHAnsi" w:cstheme="majorBidi"/>
       <w:b/>
       <w:bCs/>
-      <w:color w:val="1E40AF"/>
+      <w:color w:val="000000"/>
       <w:sz w:val="26"/>
       <w:szCs w:val="26"/>
     </w:rPr>
@@ -15399,7 +15129,7 @@
       <w:rFonts w:asciiTheme="majorHAnsi" w:eastAsiaTheme="majorEastAsia" w:hAnsiTheme="majorHAnsi" w:cstheme="majorBidi"/>
       <w:b/>
       <w:bCs/>
-      <w:color w:val="1E40AF"/>
+      <w:color w:val="000000"/>
     </w:rPr>
   </w:style>
   <w:style w:type="paragraph" w:styleId="Heading4">
@@ -15674,15 +15404,12 @@
     <w:qFormat/>
     <w:rsid w:val="00FC693F"/>
     <w:pPr>
-      <w:pBdr>
-        <w:bottom w:val="single" w:sz="8" w:space="4" w:color="4F81BD" w:themeColor="accent1"/>
-      </w:pBdr>
       <w:spacing w:after="300" w:line="240" w:lineRule="auto"/>
       <w:contextualSpacing/>
     </w:pPr>
     <w:rPr>
       <w:rFonts w:asciiTheme="majorHAnsi" w:eastAsiaTheme="majorEastAsia" w:hAnsiTheme="majorHAnsi" w:cstheme="majorBidi"/>
-      <w:color w:val="17365D" w:themeColor="text2" w:themeShade="BF"/>
+      <w:color w:val="000000"/>
       <w:spacing w:val="5"/>
       <w:kern w:val="28"/>
       <w:sz w:val="52"/>

</xml_diff>